<commit_message>
Added multiple runs (30 runs), changed bar charts to boxplots and improved code quality
</commit_message>
<xml_diff>
--- a/docs/ECM3401 activity_log_form.docx
+++ b/docs/ECM3401 activity_log_form.docx
@@ -329,7 +329,7 @@
       <w:tr>
         <w:tc>
           <w:tcPr>
-            <w:tcW w:w="819" w:type="dxa"/>
+            <w:tcW w:w="1129" w:type="dxa"/>
             <w:vAlign w:val="center"/>
           </w:tcPr>
           <w:p>
@@ -362,7 +362,7 @@
         </w:tc>
         <w:tc>
           <w:tcPr>
-            <w:tcW w:w="2452" w:type="dxa"/>
+            <w:tcW w:w="2366" w:type="dxa"/>
             <w:vAlign w:val="center"/>
           </w:tcPr>
           <w:p>
@@ -409,7 +409,7 @@
         </w:tc>
         <w:tc>
           <w:tcPr>
-            <w:tcW w:w="3016" w:type="dxa"/>
+            <w:tcW w:w="2885" w:type="dxa"/>
             <w:vAlign w:val="center"/>
           </w:tcPr>
           <w:p>
@@ -442,7 +442,7 @@
         </w:tc>
         <w:tc>
           <w:tcPr>
-            <w:tcW w:w="3049" w:type="dxa"/>
+            <w:tcW w:w="2956" w:type="dxa"/>
             <w:vAlign w:val="center"/>
           </w:tcPr>
           <w:p>
@@ -491,7 +491,7 @@
       <w:tr>
         <w:tc>
           <w:tcPr>
-            <w:tcW w:w="819" w:type="dxa"/>
+            <w:tcW w:w="1129" w:type="dxa"/>
           </w:tcPr>
           <w:p>
             <w:pPr>
@@ -514,7 +514,7 @@
         </w:tc>
         <w:tc>
           <w:tcPr>
-            <w:tcW w:w="2452" w:type="dxa"/>
+            <w:tcW w:w="2366" w:type="dxa"/>
           </w:tcPr>
           <w:p>
             <w:pPr>
@@ -553,7 +553,7 @@
         </w:tc>
         <w:tc>
           <w:tcPr>
-            <w:tcW w:w="3016" w:type="dxa"/>
+            <w:tcW w:w="2885" w:type="dxa"/>
           </w:tcPr>
           <w:p>
             <w:pPr>
@@ -576,7 +576,7 @@
         </w:tc>
         <w:tc>
           <w:tcPr>
-            <w:tcW w:w="3049" w:type="dxa"/>
+            <w:tcW w:w="2956" w:type="dxa"/>
           </w:tcPr>
           <w:p>
             <w:pPr>
@@ -601,7 +601,7 @@
       <w:tr>
         <w:tc>
           <w:tcPr>
-            <w:tcW w:w="819" w:type="dxa"/>
+            <w:tcW w:w="1129" w:type="dxa"/>
           </w:tcPr>
           <w:p>
             <w:pPr>
@@ -624,7 +624,7 @@
         </w:tc>
         <w:tc>
           <w:tcPr>
-            <w:tcW w:w="2452" w:type="dxa"/>
+            <w:tcW w:w="2366" w:type="dxa"/>
           </w:tcPr>
           <w:p>
             <w:pPr>
@@ -665,7 +665,7 @@
         </w:tc>
         <w:tc>
           <w:tcPr>
-            <w:tcW w:w="3016" w:type="dxa"/>
+            <w:tcW w:w="2885" w:type="dxa"/>
           </w:tcPr>
           <w:p>
             <w:pPr>
@@ -688,7 +688,7 @@
         </w:tc>
         <w:tc>
           <w:tcPr>
-            <w:tcW w:w="3049" w:type="dxa"/>
+            <w:tcW w:w="2956" w:type="dxa"/>
           </w:tcPr>
           <w:p>
             <w:pPr>
@@ -713,7 +713,7 @@
       <w:tr>
         <w:tc>
           <w:tcPr>
-            <w:tcW w:w="819" w:type="dxa"/>
+            <w:tcW w:w="1129" w:type="dxa"/>
           </w:tcPr>
           <w:p>
             <w:pPr>
@@ -736,7 +736,7 @@
         </w:tc>
         <w:tc>
           <w:tcPr>
-            <w:tcW w:w="2452" w:type="dxa"/>
+            <w:tcW w:w="2366" w:type="dxa"/>
           </w:tcPr>
           <w:p>
             <w:pPr>
@@ -777,33 +777,30 @@
         </w:tc>
         <w:tc>
           <w:tcPr>
-            <w:tcW w:w="3016" w:type="dxa"/>
-          </w:tcPr>
-          <w:p>
-            <w:pPr>
-              <w:pBdr>
-                <w:top w:val="none" w:sz="0" w:space="0" w:color="auto"/>
-                <w:left w:val="none" w:sz="0" w:space="0" w:color="auto"/>
-                <w:bottom w:val="none" w:sz="0" w:space="0" w:color="auto"/>
-                <w:right w:val="none" w:sz="0" w:space="0" w:color="auto"/>
-              </w:pBdr>
-              <w:tabs>
-                <w:tab w:val="center" w:pos="4324"/>
-              </w:tabs>
-              <w:spacing w:after="331" w:line="259" w:lineRule="auto"/>
-              <w:ind w:left="0" w:firstLine="0"/>
-            </w:pPr>
-            <w:r>
-              <w:t>Made a small amount of progress with nature-inspired coursework</w:t>
-            </w:r>
-            <w:r>
-              <w:t>.</w:t>
-            </w:r>
-          </w:p>
-        </w:tc>
-        <w:tc>
-          <w:tcPr>
-            <w:tcW w:w="3049" w:type="dxa"/>
+            <w:tcW w:w="2885" w:type="dxa"/>
+          </w:tcPr>
+          <w:p>
+            <w:pPr>
+              <w:pBdr>
+                <w:top w:val="none" w:sz="0" w:space="0" w:color="auto"/>
+                <w:left w:val="none" w:sz="0" w:space="0" w:color="auto"/>
+                <w:bottom w:val="none" w:sz="0" w:space="0" w:color="auto"/>
+                <w:right w:val="none" w:sz="0" w:space="0" w:color="auto"/>
+              </w:pBdr>
+              <w:tabs>
+                <w:tab w:val="center" w:pos="4324"/>
+              </w:tabs>
+              <w:spacing w:after="331" w:line="259" w:lineRule="auto"/>
+              <w:ind w:left="0" w:firstLine="0"/>
+            </w:pPr>
+            <w:r>
+              <w:t>Made a small amount of progress with nature-inspired coursework.</w:t>
+            </w:r>
+          </w:p>
+        </w:tc>
+        <w:tc>
+          <w:tcPr>
+            <w:tcW w:w="2956" w:type="dxa"/>
           </w:tcPr>
           <w:p>
             <w:pPr>
@@ -828,7 +825,7 @@
       <w:tr>
         <w:tc>
           <w:tcPr>
-            <w:tcW w:w="819" w:type="dxa"/>
+            <w:tcW w:w="1129" w:type="dxa"/>
           </w:tcPr>
           <w:p>
             <w:pPr>
@@ -851,7 +848,7 @@
         </w:tc>
         <w:tc>
           <w:tcPr>
-            <w:tcW w:w="2452" w:type="dxa"/>
+            <w:tcW w:w="2366" w:type="dxa"/>
           </w:tcPr>
           <w:p>
             <w:pPr>
@@ -892,7 +889,7 @@
         </w:tc>
         <w:tc>
           <w:tcPr>
-            <w:tcW w:w="3016" w:type="dxa"/>
+            <w:tcW w:w="2885" w:type="dxa"/>
           </w:tcPr>
           <w:p>
             <w:pPr>
@@ -918,7 +915,7 @@
         </w:tc>
         <w:tc>
           <w:tcPr>
-            <w:tcW w:w="3049" w:type="dxa"/>
+            <w:tcW w:w="2956" w:type="dxa"/>
           </w:tcPr>
           <w:p>
             <w:pPr>
@@ -943,7 +940,7 @@
       <w:tr>
         <w:tc>
           <w:tcPr>
-            <w:tcW w:w="819" w:type="dxa"/>
+            <w:tcW w:w="1129" w:type="dxa"/>
           </w:tcPr>
           <w:p>
             <w:pPr>
@@ -966,7 +963,7 @@
         </w:tc>
         <w:tc>
           <w:tcPr>
-            <w:tcW w:w="2452" w:type="dxa"/>
+            <w:tcW w:w="2366" w:type="dxa"/>
           </w:tcPr>
           <w:p>
             <w:pPr>
@@ -992,7 +989,7 @@
         </w:tc>
         <w:tc>
           <w:tcPr>
-            <w:tcW w:w="3016" w:type="dxa"/>
+            <w:tcW w:w="2885" w:type="dxa"/>
           </w:tcPr>
           <w:p>
             <w:pPr>
@@ -1015,7 +1012,7 @@
         </w:tc>
         <w:tc>
           <w:tcPr>
-            <w:tcW w:w="3049" w:type="dxa"/>
+            <w:tcW w:w="2956" w:type="dxa"/>
           </w:tcPr>
           <w:p>
             <w:pPr>
@@ -1040,7 +1037,7 @@
       <w:tr>
         <w:tc>
           <w:tcPr>
-            <w:tcW w:w="819" w:type="dxa"/>
+            <w:tcW w:w="1129" w:type="dxa"/>
           </w:tcPr>
           <w:p>
             <w:pPr>
@@ -1063,7 +1060,7 @@
         </w:tc>
         <w:tc>
           <w:tcPr>
-            <w:tcW w:w="2452" w:type="dxa"/>
+            <w:tcW w:w="2366" w:type="dxa"/>
           </w:tcPr>
           <w:p>
             <w:pPr>
@@ -1090,27 +1087,27 @@
         </w:tc>
         <w:tc>
           <w:tcPr>
-            <w:tcW w:w="3016" w:type="dxa"/>
-          </w:tcPr>
-          <w:p>
-            <w:pPr>
-              <w:pBdr>
-                <w:top w:val="none" w:sz="0" w:space="0" w:color="auto"/>
-                <w:left w:val="none" w:sz="0" w:space="0" w:color="auto"/>
-                <w:bottom w:val="none" w:sz="0" w:space="0" w:color="auto"/>
-                <w:right w:val="none" w:sz="0" w:space="0" w:color="auto"/>
-              </w:pBdr>
-              <w:tabs>
-                <w:tab w:val="center" w:pos="4324"/>
-              </w:tabs>
-              <w:spacing w:after="331" w:line="259" w:lineRule="auto"/>
-              <w:ind w:left="0" w:firstLine="0"/>
-            </w:pPr>
-          </w:p>
-        </w:tc>
-        <w:tc>
-          <w:tcPr>
-            <w:tcW w:w="3049" w:type="dxa"/>
+            <w:tcW w:w="2885" w:type="dxa"/>
+          </w:tcPr>
+          <w:p>
+            <w:pPr>
+              <w:pBdr>
+                <w:top w:val="none" w:sz="0" w:space="0" w:color="auto"/>
+                <w:left w:val="none" w:sz="0" w:space="0" w:color="auto"/>
+                <w:bottom w:val="none" w:sz="0" w:space="0" w:color="auto"/>
+                <w:right w:val="none" w:sz="0" w:space="0" w:color="auto"/>
+              </w:pBdr>
+              <w:tabs>
+                <w:tab w:val="center" w:pos="4324"/>
+              </w:tabs>
+              <w:spacing w:after="331" w:line="259" w:lineRule="auto"/>
+              <w:ind w:left="0" w:firstLine="0"/>
+            </w:pPr>
+          </w:p>
+        </w:tc>
+        <w:tc>
+          <w:tcPr>
+            <w:tcW w:w="2956" w:type="dxa"/>
           </w:tcPr>
           <w:p>
             <w:pPr>
@@ -1132,7 +1129,7 @@
       <w:tr>
         <w:tc>
           <w:tcPr>
-            <w:tcW w:w="819" w:type="dxa"/>
+            <w:tcW w:w="1129" w:type="dxa"/>
           </w:tcPr>
           <w:p>
             <w:pPr>
@@ -1155,7 +1152,7 @@
         </w:tc>
         <w:tc>
           <w:tcPr>
-            <w:tcW w:w="2452" w:type="dxa"/>
+            <w:tcW w:w="2366" w:type="dxa"/>
           </w:tcPr>
           <w:p>
             <w:pPr>
@@ -1181,27 +1178,27 @@
         </w:tc>
         <w:tc>
           <w:tcPr>
-            <w:tcW w:w="3016" w:type="dxa"/>
-          </w:tcPr>
-          <w:p>
-            <w:pPr>
-              <w:pBdr>
-                <w:top w:val="none" w:sz="0" w:space="0" w:color="auto"/>
-                <w:left w:val="none" w:sz="0" w:space="0" w:color="auto"/>
-                <w:bottom w:val="none" w:sz="0" w:space="0" w:color="auto"/>
-                <w:right w:val="none" w:sz="0" w:space="0" w:color="auto"/>
-              </w:pBdr>
-              <w:tabs>
-                <w:tab w:val="center" w:pos="4324"/>
-              </w:tabs>
-              <w:spacing w:after="331" w:line="259" w:lineRule="auto"/>
-              <w:ind w:left="0" w:firstLine="0"/>
-            </w:pPr>
-          </w:p>
-        </w:tc>
-        <w:tc>
-          <w:tcPr>
-            <w:tcW w:w="3049" w:type="dxa"/>
+            <w:tcW w:w="2885" w:type="dxa"/>
+          </w:tcPr>
+          <w:p>
+            <w:pPr>
+              <w:pBdr>
+                <w:top w:val="none" w:sz="0" w:space="0" w:color="auto"/>
+                <w:left w:val="none" w:sz="0" w:space="0" w:color="auto"/>
+                <w:bottom w:val="none" w:sz="0" w:space="0" w:color="auto"/>
+                <w:right w:val="none" w:sz="0" w:space="0" w:color="auto"/>
+              </w:pBdr>
+              <w:tabs>
+                <w:tab w:val="center" w:pos="4324"/>
+              </w:tabs>
+              <w:spacing w:after="331" w:line="259" w:lineRule="auto"/>
+              <w:ind w:left="0" w:firstLine="0"/>
+            </w:pPr>
+          </w:p>
+        </w:tc>
+        <w:tc>
+          <w:tcPr>
+            <w:tcW w:w="2956" w:type="dxa"/>
           </w:tcPr>
           <w:p>
             <w:pPr>
@@ -1223,7 +1220,7 @@
       <w:tr>
         <w:tc>
           <w:tcPr>
-            <w:tcW w:w="819" w:type="dxa"/>
+            <w:tcW w:w="1129" w:type="dxa"/>
           </w:tcPr>
           <w:p>
             <w:pPr>
@@ -1246,7 +1243,7 @@
         </w:tc>
         <w:tc>
           <w:tcPr>
-            <w:tcW w:w="2452" w:type="dxa"/>
+            <w:tcW w:w="2366" w:type="dxa"/>
           </w:tcPr>
           <w:p>
             <w:pPr>
@@ -1277,27 +1274,27 @@
         </w:tc>
         <w:tc>
           <w:tcPr>
-            <w:tcW w:w="3016" w:type="dxa"/>
-          </w:tcPr>
-          <w:p>
-            <w:pPr>
-              <w:pBdr>
-                <w:top w:val="none" w:sz="0" w:space="0" w:color="auto"/>
-                <w:left w:val="none" w:sz="0" w:space="0" w:color="auto"/>
-                <w:bottom w:val="none" w:sz="0" w:space="0" w:color="auto"/>
-                <w:right w:val="none" w:sz="0" w:space="0" w:color="auto"/>
-              </w:pBdr>
-              <w:tabs>
-                <w:tab w:val="center" w:pos="4324"/>
-              </w:tabs>
-              <w:spacing w:after="331" w:line="259" w:lineRule="auto"/>
-              <w:ind w:left="0" w:firstLine="0"/>
-            </w:pPr>
-          </w:p>
-        </w:tc>
-        <w:tc>
-          <w:tcPr>
-            <w:tcW w:w="3049" w:type="dxa"/>
+            <w:tcW w:w="2885" w:type="dxa"/>
+          </w:tcPr>
+          <w:p>
+            <w:pPr>
+              <w:pBdr>
+                <w:top w:val="none" w:sz="0" w:space="0" w:color="auto"/>
+                <w:left w:val="none" w:sz="0" w:space="0" w:color="auto"/>
+                <w:bottom w:val="none" w:sz="0" w:space="0" w:color="auto"/>
+                <w:right w:val="none" w:sz="0" w:space="0" w:color="auto"/>
+              </w:pBdr>
+              <w:tabs>
+                <w:tab w:val="center" w:pos="4324"/>
+              </w:tabs>
+              <w:spacing w:after="331" w:line="259" w:lineRule="auto"/>
+              <w:ind w:left="0" w:firstLine="0"/>
+            </w:pPr>
+          </w:p>
+        </w:tc>
+        <w:tc>
+          <w:tcPr>
+            <w:tcW w:w="2956" w:type="dxa"/>
           </w:tcPr>
           <w:p>
             <w:pPr>
@@ -1319,7 +1316,7 @@
       <w:tr>
         <w:tc>
           <w:tcPr>
-            <w:tcW w:w="819" w:type="dxa"/>
+            <w:tcW w:w="1129" w:type="dxa"/>
           </w:tcPr>
           <w:p>
             <w:pPr>
@@ -1345,47 +1342,47 @@
         </w:tc>
         <w:tc>
           <w:tcPr>
-            <w:tcW w:w="2452" w:type="dxa"/>
-          </w:tcPr>
-          <w:p>
-            <w:pPr>
-              <w:pBdr>
-                <w:top w:val="none" w:sz="0" w:space="0" w:color="auto"/>
-                <w:left w:val="none" w:sz="0" w:space="0" w:color="auto"/>
-                <w:bottom w:val="none" w:sz="0" w:space="0" w:color="auto"/>
-                <w:right w:val="none" w:sz="0" w:space="0" w:color="auto"/>
-              </w:pBdr>
-              <w:tabs>
-                <w:tab w:val="center" w:pos="4324"/>
-              </w:tabs>
-              <w:spacing w:after="331" w:line="259" w:lineRule="auto"/>
-              <w:ind w:left="0" w:firstLine="0"/>
-            </w:pPr>
-          </w:p>
-        </w:tc>
-        <w:tc>
-          <w:tcPr>
-            <w:tcW w:w="3016" w:type="dxa"/>
-          </w:tcPr>
-          <w:p>
-            <w:pPr>
-              <w:pBdr>
-                <w:top w:val="none" w:sz="0" w:space="0" w:color="auto"/>
-                <w:left w:val="none" w:sz="0" w:space="0" w:color="auto"/>
-                <w:bottom w:val="none" w:sz="0" w:space="0" w:color="auto"/>
-                <w:right w:val="none" w:sz="0" w:space="0" w:color="auto"/>
-              </w:pBdr>
-              <w:tabs>
-                <w:tab w:val="center" w:pos="4324"/>
-              </w:tabs>
-              <w:spacing w:after="331" w:line="259" w:lineRule="auto"/>
-              <w:ind w:left="0" w:firstLine="0"/>
-            </w:pPr>
-          </w:p>
-        </w:tc>
-        <w:tc>
-          <w:tcPr>
-            <w:tcW w:w="3049" w:type="dxa"/>
+            <w:tcW w:w="2366" w:type="dxa"/>
+          </w:tcPr>
+          <w:p>
+            <w:pPr>
+              <w:pBdr>
+                <w:top w:val="none" w:sz="0" w:space="0" w:color="auto"/>
+                <w:left w:val="none" w:sz="0" w:space="0" w:color="auto"/>
+                <w:bottom w:val="none" w:sz="0" w:space="0" w:color="auto"/>
+                <w:right w:val="none" w:sz="0" w:space="0" w:color="auto"/>
+              </w:pBdr>
+              <w:tabs>
+                <w:tab w:val="center" w:pos="4324"/>
+              </w:tabs>
+              <w:spacing w:after="331" w:line="259" w:lineRule="auto"/>
+              <w:ind w:left="0" w:firstLine="0"/>
+            </w:pPr>
+          </w:p>
+        </w:tc>
+        <w:tc>
+          <w:tcPr>
+            <w:tcW w:w="2885" w:type="dxa"/>
+          </w:tcPr>
+          <w:p>
+            <w:pPr>
+              <w:pBdr>
+                <w:top w:val="none" w:sz="0" w:space="0" w:color="auto"/>
+                <w:left w:val="none" w:sz="0" w:space="0" w:color="auto"/>
+                <w:bottom w:val="none" w:sz="0" w:space="0" w:color="auto"/>
+                <w:right w:val="none" w:sz="0" w:space="0" w:color="auto"/>
+              </w:pBdr>
+              <w:tabs>
+                <w:tab w:val="center" w:pos="4324"/>
+              </w:tabs>
+              <w:spacing w:after="331" w:line="259" w:lineRule="auto"/>
+              <w:ind w:left="0" w:firstLine="0"/>
+            </w:pPr>
+          </w:p>
+        </w:tc>
+        <w:tc>
+          <w:tcPr>
+            <w:tcW w:w="2956" w:type="dxa"/>
           </w:tcPr>
           <w:p>
             <w:pPr>
@@ -1407,70 +1404,76 @@
       <w:tr>
         <w:tc>
           <w:tcPr>
-            <w:tcW w:w="819" w:type="dxa"/>
-          </w:tcPr>
-          <w:p>
-            <w:pPr>
-              <w:pBdr>
-                <w:top w:val="none" w:sz="0" w:space="0" w:color="auto"/>
-                <w:left w:val="none" w:sz="0" w:space="0" w:color="auto"/>
-                <w:bottom w:val="none" w:sz="0" w:space="0" w:color="auto"/>
-                <w:right w:val="none" w:sz="0" w:space="0" w:color="auto"/>
-              </w:pBdr>
-              <w:tabs>
-                <w:tab w:val="center" w:pos="4324"/>
-              </w:tabs>
-              <w:spacing w:after="331" w:line="259" w:lineRule="auto"/>
-              <w:ind w:left="0" w:firstLine="0"/>
-            </w:pPr>
-            <w:r>
-              <w:t>10/11/2025</w:t>
-            </w:r>
-          </w:p>
-        </w:tc>
-        <w:tc>
-          <w:tcPr>
-            <w:tcW w:w="2452" w:type="dxa"/>
-          </w:tcPr>
-          <w:p>
-            <w:pPr>
-              <w:pBdr>
-                <w:top w:val="none" w:sz="0" w:space="0" w:color="auto"/>
-                <w:left w:val="none" w:sz="0" w:space="0" w:color="auto"/>
-                <w:bottom w:val="none" w:sz="0" w:space="0" w:color="auto"/>
-                <w:right w:val="none" w:sz="0" w:space="0" w:color="auto"/>
-              </w:pBdr>
-              <w:tabs>
-                <w:tab w:val="center" w:pos="4324"/>
-              </w:tabs>
-              <w:spacing w:after="331" w:line="259" w:lineRule="auto"/>
-              <w:ind w:left="0" w:firstLine="0"/>
-            </w:pPr>
-          </w:p>
-        </w:tc>
-        <w:tc>
-          <w:tcPr>
-            <w:tcW w:w="3016" w:type="dxa"/>
-          </w:tcPr>
-          <w:p>
-            <w:pPr>
-              <w:pBdr>
-                <w:top w:val="none" w:sz="0" w:space="0" w:color="auto"/>
-                <w:left w:val="none" w:sz="0" w:space="0" w:color="auto"/>
-                <w:bottom w:val="none" w:sz="0" w:space="0" w:color="auto"/>
-                <w:right w:val="none" w:sz="0" w:space="0" w:color="auto"/>
-              </w:pBdr>
-              <w:tabs>
-                <w:tab w:val="center" w:pos="4324"/>
-              </w:tabs>
-              <w:spacing w:after="331" w:line="259" w:lineRule="auto"/>
-              <w:ind w:left="0" w:firstLine="0"/>
-            </w:pPr>
-          </w:p>
-        </w:tc>
-        <w:tc>
-          <w:tcPr>
-            <w:tcW w:w="3049" w:type="dxa"/>
+            <w:tcW w:w="1129" w:type="dxa"/>
+          </w:tcPr>
+          <w:p>
+            <w:pPr>
+              <w:pBdr>
+                <w:top w:val="none" w:sz="0" w:space="0" w:color="auto"/>
+                <w:left w:val="none" w:sz="0" w:space="0" w:color="auto"/>
+                <w:bottom w:val="none" w:sz="0" w:space="0" w:color="auto"/>
+                <w:right w:val="none" w:sz="0" w:space="0" w:color="auto"/>
+              </w:pBdr>
+              <w:tabs>
+                <w:tab w:val="center" w:pos="4324"/>
+              </w:tabs>
+              <w:spacing w:after="331" w:line="259" w:lineRule="auto"/>
+              <w:ind w:left="0" w:firstLine="0"/>
+            </w:pPr>
+            <w:r>
+              <w:t>10/1</w:t>
+            </w:r>
+            <w:r>
+              <w:t>2</w:t>
+            </w:r>
+            <w:r>
+              <w:t>/2025</w:t>
+            </w:r>
+          </w:p>
+        </w:tc>
+        <w:tc>
+          <w:tcPr>
+            <w:tcW w:w="2366" w:type="dxa"/>
+          </w:tcPr>
+          <w:p>
+            <w:pPr>
+              <w:pBdr>
+                <w:top w:val="none" w:sz="0" w:space="0" w:color="auto"/>
+                <w:left w:val="none" w:sz="0" w:space="0" w:color="auto"/>
+                <w:bottom w:val="none" w:sz="0" w:space="0" w:color="auto"/>
+                <w:right w:val="none" w:sz="0" w:space="0" w:color="auto"/>
+              </w:pBdr>
+              <w:tabs>
+                <w:tab w:val="center" w:pos="4324"/>
+              </w:tabs>
+              <w:spacing w:after="331" w:line="259" w:lineRule="auto"/>
+              <w:ind w:left="0" w:firstLine="0"/>
+            </w:pPr>
+          </w:p>
+        </w:tc>
+        <w:tc>
+          <w:tcPr>
+            <w:tcW w:w="2885" w:type="dxa"/>
+          </w:tcPr>
+          <w:p>
+            <w:pPr>
+              <w:pBdr>
+                <w:top w:val="none" w:sz="0" w:space="0" w:color="auto"/>
+                <w:left w:val="none" w:sz="0" w:space="0" w:color="auto"/>
+                <w:bottom w:val="none" w:sz="0" w:space="0" w:color="auto"/>
+                <w:right w:val="none" w:sz="0" w:space="0" w:color="auto"/>
+              </w:pBdr>
+              <w:tabs>
+                <w:tab w:val="center" w:pos="4324"/>
+              </w:tabs>
+              <w:spacing w:after="331" w:line="259" w:lineRule="auto"/>
+              <w:ind w:left="0" w:firstLine="0"/>
+            </w:pPr>
+          </w:p>
+        </w:tc>
+        <w:tc>
+          <w:tcPr>
+            <w:tcW w:w="2956" w:type="dxa"/>
           </w:tcPr>
           <w:p>
             <w:pPr>
@@ -1492,7 +1495,7 @@
       <w:tr>
         <w:tc>
           <w:tcPr>
-            <w:tcW w:w="819" w:type="dxa"/>
+            <w:tcW w:w="1129" w:type="dxa"/>
           </w:tcPr>
           <w:p>
             <w:pPr>
@@ -1515,7 +1518,7 @@
         </w:tc>
         <w:tc>
           <w:tcPr>
-            <w:tcW w:w="2452" w:type="dxa"/>
+            <w:tcW w:w="2366" w:type="dxa"/>
           </w:tcPr>
           <w:p>
             <w:pPr>
@@ -1538,27 +1541,27 @@
         </w:tc>
         <w:tc>
           <w:tcPr>
-            <w:tcW w:w="3016" w:type="dxa"/>
-          </w:tcPr>
-          <w:p>
-            <w:pPr>
-              <w:pBdr>
-                <w:top w:val="none" w:sz="0" w:space="0" w:color="auto"/>
-                <w:left w:val="none" w:sz="0" w:space="0" w:color="auto"/>
-                <w:bottom w:val="none" w:sz="0" w:space="0" w:color="auto"/>
-                <w:right w:val="none" w:sz="0" w:space="0" w:color="auto"/>
-              </w:pBdr>
-              <w:tabs>
-                <w:tab w:val="center" w:pos="4324"/>
-              </w:tabs>
-              <w:spacing w:after="331" w:line="259" w:lineRule="auto"/>
-              <w:ind w:left="0" w:firstLine="0"/>
-            </w:pPr>
-          </w:p>
-        </w:tc>
-        <w:tc>
-          <w:tcPr>
-            <w:tcW w:w="3049" w:type="dxa"/>
+            <w:tcW w:w="2885" w:type="dxa"/>
+          </w:tcPr>
+          <w:p>
+            <w:pPr>
+              <w:pBdr>
+                <w:top w:val="none" w:sz="0" w:space="0" w:color="auto"/>
+                <w:left w:val="none" w:sz="0" w:space="0" w:color="auto"/>
+                <w:bottom w:val="none" w:sz="0" w:space="0" w:color="auto"/>
+                <w:right w:val="none" w:sz="0" w:space="0" w:color="auto"/>
+              </w:pBdr>
+              <w:tabs>
+                <w:tab w:val="center" w:pos="4324"/>
+              </w:tabs>
+              <w:spacing w:after="331" w:line="259" w:lineRule="auto"/>
+              <w:ind w:left="0" w:firstLine="0"/>
+            </w:pPr>
+          </w:p>
+        </w:tc>
+        <w:tc>
+          <w:tcPr>
+            <w:tcW w:w="2956" w:type="dxa"/>
           </w:tcPr>
           <w:p>
             <w:pPr>
@@ -1580,67 +1583,73 @@
       <w:tr>
         <w:tc>
           <w:tcPr>
-            <w:tcW w:w="819" w:type="dxa"/>
-          </w:tcPr>
-          <w:p>
-            <w:pPr>
-              <w:pBdr>
-                <w:top w:val="none" w:sz="0" w:space="0" w:color="auto"/>
-                <w:left w:val="none" w:sz="0" w:space="0" w:color="auto"/>
-                <w:bottom w:val="none" w:sz="0" w:space="0" w:color="auto"/>
-                <w:right w:val="none" w:sz="0" w:space="0" w:color="auto"/>
-              </w:pBdr>
-              <w:tabs>
-                <w:tab w:val="center" w:pos="4324"/>
-              </w:tabs>
-              <w:spacing w:after="331" w:line="259" w:lineRule="auto"/>
-              <w:ind w:left="0" w:firstLine="0"/>
-            </w:pPr>
-          </w:p>
-        </w:tc>
-        <w:tc>
-          <w:tcPr>
-            <w:tcW w:w="2452" w:type="dxa"/>
-          </w:tcPr>
-          <w:p>
-            <w:pPr>
-              <w:pBdr>
-                <w:top w:val="none" w:sz="0" w:space="0" w:color="auto"/>
-                <w:left w:val="none" w:sz="0" w:space="0" w:color="auto"/>
-                <w:bottom w:val="none" w:sz="0" w:space="0" w:color="auto"/>
-                <w:right w:val="none" w:sz="0" w:space="0" w:color="auto"/>
-              </w:pBdr>
-              <w:tabs>
-                <w:tab w:val="center" w:pos="4324"/>
-              </w:tabs>
-              <w:spacing w:after="331" w:line="259" w:lineRule="auto"/>
-              <w:ind w:left="0" w:firstLine="0"/>
-            </w:pPr>
-          </w:p>
-        </w:tc>
-        <w:tc>
-          <w:tcPr>
-            <w:tcW w:w="3016" w:type="dxa"/>
-          </w:tcPr>
-          <w:p>
-            <w:pPr>
-              <w:pBdr>
-                <w:top w:val="none" w:sz="0" w:space="0" w:color="auto"/>
-                <w:left w:val="none" w:sz="0" w:space="0" w:color="auto"/>
-                <w:bottom w:val="none" w:sz="0" w:space="0" w:color="auto"/>
-                <w:right w:val="none" w:sz="0" w:space="0" w:color="auto"/>
-              </w:pBdr>
-              <w:tabs>
-                <w:tab w:val="center" w:pos="4324"/>
-              </w:tabs>
-              <w:spacing w:after="331" w:line="259" w:lineRule="auto"/>
-              <w:ind w:left="0" w:firstLine="0"/>
-            </w:pPr>
-          </w:p>
-        </w:tc>
-        <w:tc>
-          <w:tcPr>
-            <w:tcW w:w="3049" w:type="dxa"/>
+            <w:tcW w:w="1129" w:type="dxa"/>
+          </w:tcPr>
+          <w:p>
+            <w:pPr>
+              <w:pBdr>
+                <w:top w:val="none" w:sz="0" w:space="0" w:color="auto"/>
+                <w:left w:val="none" w:sz="0" w:space="0" w:color="auto"/>
+                <w:bottom w:val="none" w:sz="0" w:space="0" w:color="auto"/>
+                <w:right w:val="none" w:sz="0" w:space="0" w:color="auto"/>
+              </w:pBdr>
+              <w:tabs>
+                <w:tab w:val="center" w:pos="4324"/>
+              </w:tabs>
+              <w:spacing w:after="331" w:line="259" w:lineRule="auto"/>
+              <w:ind w:left="0" w:firstLine="0"/>
+            </w:pPr>
+            <w:r>
+              <w:t>9/1/2026</w:t>
+            </w:r>
+          </w:p>
+        </w:tc>
+        <w:tc>
+          <w:tcPr>
+            <w:tcW w:w="2366" w:type="dxa"/>
+          </w:tcPr>
+          <w:p>
+            <w:pPr>
+              <w:pBdr>
+                <w:top w:val="none" w:sz="0" w:space="0" w:color="auto"/>
+                <w:left w:val="none" w:sz="0" w:space="0" w:color="auto"/>
+                <w:bottom w:val="none" w:sz="0" w:space="0" w:color="auto"/>
+                <w:right w:val="none" w:sz="0" w:space="0" w:color="auto"/>
+              </w:pBdr>
+              <w:tabs>
+                <w:tab w:val="center" w:pos="4324"/>
+              </w:tabs>
+              <w:spacing w:after="331" w:line="259" w:lineRule="auto"/>
+              <w:ind w:left="0" w:firstLine="0"/>
+            </w:pPr>
+            <w:r>
+              <w:t xml:space="preserve">Came back from Christmas holiday, </w:t>
+            </w:r>
+          </w:p>
+        </w:tc>
+        <w:tc>
+          <w:tcPr>
+            <w:tcW w:w="2885" w:type="dxa"/>
+          </w:tcPr>
+          <w:p>
+            <w:pPr>
+              <w:pBdr>
+                <w:top w:val="none" w:sz="0" w:space="0" w:color="auto"/>
+                <w:left w:val="none" w:sz="0" w:space="0" w:color="auto"/>
+                <w:bottom w:val="none" w:sz="0" w:space="0" w:color="auto"/>
+                <w:right w:val="none" w:sz="0" w:space="0" w:color="auto"/>
+              </w:pBdr>
+              <w:tabs>
+                <w:tab w:val="center" w:pos="4324"/>
+              </w:tabs>
+              <w:spacing w:after="331" w:line="259" w:lineRule="auto"/>
+              <w:ind w:left="0" w:firstLine="0"/>
+            </w:pPr>
+          </w:p>
+        </w:tc>
+        <w:tc>
+          <w:tcPr>
+            <w:tcW w:w="2956" w:type="dxa"/>
           </w:tcPr>
           <w:p>
             <w:pPr>
@@ -1662,67 +1671,70 @@
       <w:tr>
         <w:tc>
           <w:tcPr>
-            <w:tcW w:w="819" w:type="dxa"/>
-          </w:tcPr>
-          <w:p>
-            <w:pPr>
-              <w:pBdr>
-                <w:top w:val="none" w:sz="0" w:space="0" w:color="auto"/>
-                <w:left w:val="none" w:sz="0" w:space="0" w:color="auto"/>
-                <w:bottom w:val="none" w:sz="0" w:space="0" w:color="auto"/>
-                <w:right w:val="none" w:sz="0" w:space="0" w:color="auto"/>
-              </w:pBdr>
-              <w:tabs>
-                <w:tab w:val="center" w:pos="4324"/>
-              </w:tabs>
-              <w:spacing w:after="331" w:line="259" w:lineRule="auto"/>
-              <w:ind w:left="0" w:firstLine="0"/>
-            </w:pPr>
-          </w:p>
-        </w:tc>
-        <w:tc>
-          <w:tcPr>
-            <w:tcW w:w="2452" w:type="dxa"/>
-          </w:tcPr>
-          <w:p>
-            <w:pPr>
-              <w:pBdr>
-                <w:top w:val="none" w:sz="0" w:space="0" w:color="auto"/>
-                <w:left w:val="none" w:sz="0" w:space="0" w:color="auto"/>
-                <w:bottom w:val="none" w:sz="0" w:space="0" w:color="auto"/>
-                <w:right w:val="none" w:sz="0" w:space="0" w:color="auto"/>
-              </w:pBdr>
-              <w:tabs>
-                <w:tab w:val="center" w:pos="4324"/>
-              </w:tabs>
-              <w:spacing w:after="331" w:line="259" w:lineRule="auto"/>
-              <w:ind w:left="0" w:firstLine="0"/>
-            </w:pPr>
-          </w:p>
-        </w:tc>
-        <w:tc>
-          <w:tcPr>
-            <w:tcW w:w="3016" w:type="dxa"/>
-          </w:tcPr>
-          <w:p>
-            <w:pPr>
-              <w:pBdr>
-                <w:top w:val="none" w:sz="0" w:space="0" w:color="auto"/>
-                <w:left w:val="none" w:sz="0" w:space="0" w:color="auto"/>
-                <w:bottom w:val="none" w:sz="0" w:space="0" w:color="auto"/>
-                <w:right w:val="none" w:sz="0" w:space="0" w:color="auto"/>
-              </w:pBdr>
-              <w:tabs>
-                <w:tab w:val="center" w:pos="4324"/>
-              </w:tabs>
-              <w:spacing w:after="331" w:line="259" w:lineRule="auto"/>
-              <w:ind w:left="0" w:firstLine="0"/>
-            </w:pPr>
-          </w:p>
-        </w:tc>
-        <w:tc>
-          <w:tcPr>
-            <w:tcW w:w="3049" w:type="dxa"/>
+            <w:tcW w:w="1129" w:type="dxa"/>
+          </w:tcPr>
+          <w:p>
+            <w:pPr>
+              <w:pBdr>
+                <w:top w:val="none" w:sz="0" w:space="0" w:color="auto"/>
+                <w:left w:val="none" w:sz="0" w:space="0" w:color="auto"/>
+                <w:bottom w:val="none" w:sz="0" w:space="0" w:color="auto"/>
+                <w:right w:val="none" w:sz="0" w:space="0" w:color="auto"/>
+              </w:pBdr>
+              <w:tabs>
+                <w:tab w:val="center" w:pos="4324"/>
+              </w:tabs>
+              <w:spacing w:after="331" w:line="259" w:lineRule="auto"/>
+              <w:ind w:left="0" w:firstLine="0"/>
+            </w:pPr>
+            <w:r>
+              <w:t>13/1/2026</w:t>
+            </w:r>
+          </w:p>
+        </w:tc>
+        <w:tc>
+          <w:tcPr>
+            <w:tcW w:w="2366" w:type="dxa"/>
+          </w:tcPr>
+          <w:p>
+            <w:pPr>
+              <w:pBdr>
+                <w:top w:val="none" w:sz="0" w:space="0" w:color="auto"/>
+                <w:left w:val="none" w:sz="0" w:space="0" w:color="auto"/>
+                <w:bottom w:val="none" w:sz="0" w:space="0" w:color="auto"/>
+                <w:right w:val="none" w:sz="0" w:space="0" w:color="auto"/>
+              </w:pBdr>
+              <w:tabs>
+                <w:tab w:val="center" w:pos="4324"/>
+              </w:tabs>
+              <w:spacing w:after="331" w:line="259" w:lineRule="auto"/>
+              <w:ind w:left="0" w:firstLine="0"/>
+            </w:pPr>
+          </w:p>
+        </w:tc>
+        <w:tc>
+          <w:tcPr>
+            <w:tcW w:w="2885" w:type="dxa"/>
+          </w:tcPr>
+          <w:p>
+            <w:pPr>
+              <w:pBdr>
+                <w:top w:val="none" w:sz="0" w:space="0" w:color="auto"/>
+                <w:left w:val="none" w:sz="0" w:space="0" w:color="auto"/>
+                <w:bottom w:val="none" w:sz="0" w:space="0" w:color="auto"/>
+                <w:right w:val="none" w:sz="0" w:space="0" w:color="auto"/>
+              </w:pBdr>
+              <w:tabs>
+                <w:tab w:val="center" w:pos="4324"/>
+              </w:tabs>
+              <w:spacing w:after="331" w:line="259" w:lineRule="auto"/>
+              <w:ind w:left="0" w:firstLine="0"/>
+            </w:pPr>
+          </w:p>
+        </w:tc>
+        <w:tc>
+          <w:tcPr>
+            <w:tcW w:w="2956" w:type="dxa"/>
           </w:tcPr>
           <w:p>
             <w:pPr>
@@ -1744,67 +1756,70 @@
       <w:tr>
         <w:tc>
           <w:tcPr>
-            <w:tcW w:w="819" w:type="dxa"/>
-          </w:tcPr>
-          <w:p>
-            <w:pPr>
-              <w:pBdr>
-                <w:top w:val="none" w:sz="0" w:space="0" w:color="auto"/>
-                <w:left w:val="none" w:sz="0" w:space="0" w:color="auto"/>
-                <w:bottom w:val="none" w:sz="0" w:space="0" w:color="auto"/>
-                <w:right w:val="none" w:sz="0" w:space="0" w:color="auto"/>
-              </w:pBdr>
-              <w:tabs>
-                <w:tab w:val="center" w:pos="4324"/>
-              </w:tabs>
-              <w:spacing w:after="331" w:line="259" w:lineRule="auto"/>
-              <w:ind w:left="0" w:firstLine="0"/>
-            </w:pPr>
-          </w:p>
-        </w:tc>
-        <w:tc>
-          <w:tcPr>
-            <w:tcW w:w="2452" w:type="dxa"/>
-          </w:tcPr>
-          <w:p>
-            <w:pPr>
-              <w:pBdr>
-                <w:top w:val="none" w:sz="0" w:space="0" w:color="auto"/>
-                <w:left w:val="none" w:sz="0" w:space="0" w:color="auto"/>
-                <w:bottom w:val="none" w:sz="0" w:space="0" w:color="auto"/>
-                <w:right w:val="none" w:sz="0" w:space="0" w:color="auto"/>
-              </w:pBdr>
-              <w:tabs>
-                <w:tab w:val="center" w:pos="4324"/>
-              </w:tabs>
-              <w:spacing w:after="331" w:line="259" w:lineRule="auto"/>
-              <w:ind w:left="0" w:firstLine="0"/>
-            </w:pPr>
-          </w:p>
-        </w:tc>
-        <w:tc>
-          <w:tcPr>
-            <w:tcW w:w="3016" w:type="dxa"/>
-          </w:tcPr>
-          <w:p>
-            <w:pPr>
-              <w:pBdr>
-                <w:top w:val="none" w:sz="0" w:space="0" w:color="auto"/>
-                <w:left w:val="none" w:sz="0" w:space="0" w:color="auto"/>
-                <w:bottom w:val="none" w:sz="0" w:space="0" w:color="auto"/>
-                <w:right w:val="none" w:sz="0" w:space="0" w:color="auto"/>
-              </w:pBdr>
-              <w:tabs>
-                <w:tab w:val="center" w:pos="4324"/>
-              </w:tabs>
-              <w:spacing w:after="331" w:line="259" w:lineRule="auto"/>
-              <w:ind w:left="0" w:firstLine="0"/>
-            </w:pPr>
-          </w:p>
-        </w:tc>
-        <w:tc>
-          <w:tcPr>
-            <w:tcW w:w="3049" w:type="dxa"/>
+            <w:tcW w:w="1129" w:type="dxa"/>
+          </w:tcPr>
+          <w:p>
+            <w:pPr>
+              <w:pBdr>
+                <w:top w:val="none" w:sz="0" w:space="0" w:color="auto"/>
+                <w:left w:val="none" w:sz="0" w:space="0" w:color="auto"/>
+                <w:bottom w:val="none" w:sz="0" w:space="0" w:color="auto"/>
+                <w:right w:val="none" w:sz="0" w:space="0" w:color="auto"/>
+              </w:pBdr>
+              <w:tabs>
+                <w:tab w:val="center" w:pos="4324"/>
+              </w:tabs>
+              <w:spacing w:after="331" w:line="259" w:lineRule="auto"/>
+              <w:ind w:left="0" w:firstLine="0"/>
+            </w:pPr>
+            <w:r>
+              <w:t>20/1/2026</w:t>
+            </w:r>
+          </w:p>
+        </w:tc>
+        <w:tc>
+          <w:tcPr>
+            <w:tcW w:w="2366" w:type="dxa"/>
+          </w:tcPr>
+          <w:p>
+            <w:pPr>
+              <w:pBdr>
+                <w:top w:val="none" w:sz="0" w:space="0" w:color="auto"/>
+                <w:left w:val="none" w:sz="0" w:space="0" w:color="auto"/>
+                <w:bottom w:val="none" w:sz="0" w:space="0" w:color="auto"/>
+                <w:right w:val="none" w:sz="0" w:space="0" w:color="auto"/>
+              </w:pBdr>
+              <w:tabs>
+                <w:tab w:val="center" w:pos="4324"/>
+              </w:tabs>
+              <w:spacing w:after="331" w:line="259" w:lineRule="auto"/>
+              <w:ind w:left="0" w:firstLine="0"/>
+            </w:pPr>
+          </w:p>
+        </w:tc>
+        <w:tc>
+          <w:tcPr>
+            <w:tcW w:w="2885" w:type="dxa"/>
+          </w:tcPr>
+          <w:p>
+            <w:pPr>
+              <w:pBdr>
+                <w:top w:val="none" w:sz="0" w:space="0" w:color="auto"/>
+                <w:left w:val="none" w:sz="0" w:space="0" w:color="auto"/>
+                <w:bottom w:val="none" w:sz="0" w:space="0" w:color="auto"/>
+                <w:right w:val="none" w:sz="0" w:space="0" w:color="auto"/>
+              </w:pBdr>
+              <w:tabs>
+                <w:tab w:val="center" w:pos="4324"/>
+              </w:tabs>
+              <w:spacing w:after="331" w:line="259" w:lineRule="auto"/>
+              <w:ind w:left="0" w:firstLine="0"/>
+            </w:pPr>
+          </w:p>
+        </w:tc>
+        <w:tc>
+          <w:tcPr>
+            <w:tcW w:w="2956" w:type="dxa"/>
           </w:tcPr>
           <w:p>
             <w:pPr>
@@ -1826,67 +1841,1202 @@
       <w:tr>
         <w:tc>
           <w:tcPr>
-            <w:tcW w:w="819" w:type="dxa"/>
-          </w:tcPr>
-          <w:p>
-            <w:pPr>
-              <w:pBdr>
-                <w:top w:val="none" w:sz="0" w:space="0" w:color="auto"/>
-                <w:left w:val="none" w:sz="0" w:space="0" w:color="auto"/>
-                <w:bottom w:val="none" w:sz="0" w:space="0" w:color="auto"/>
-                <w:right w:val="none" w:sz="0" w:space="0" w:color="auto"/>
-              </w:pBdr>
-              <w:tabs>
-                <w:tab w:val="center" w:pos="4324"/>
-              </w:tabs>
-              <w:spacing w:after="331" w:line="259" w:lineRule="auto"/>
-              <w:ind w:left="0" w:firstLine="0"/>
-            </w:pPr>
-          </w:p>
-        </w:tc>
-        <w:tc>
-          <w:tcPr>
-            <w:tcW w:w="2452" w:type="dxa"/>
-          </w:tcPr>
-          <w:p>
-            <w:pPr>
-              <w:pBdr>
-                <w:top w:val="none" w:sz="0" w:space="0" w:color="auto"/>
-                <w:left w:val="none" w:sz="0" w:space="0" w:color="auto"/>
-                <w:bottom w:val="none" w:sz="0" w:space="0" w:color="auto"/>
-                <w:right w:val="none" w:sz="0" w:space="0" w:color="auto"/>
-              </w:pBdr>
-              <w:tabs>
-                <w:tab w:val="center" w:pos="4324"/>
-              </w:tabs>
-              <w:spacing w:after="331" w:line="259" w:lineRule="auto"/>
-              <w:ind w:left="0" w:firstLine="0"/>
-            </w:pPr>
-          </w:p>
-        </w:tc>
-        <w:tc>
-          <w:tcPr>
-            <w:tcW w:w="3016" w:type="dxa"/>
-          </w:tcPr>
-          <w:p>
-            <w:pPr>
-              <w:pBdr>
-                <w:top w:val="none" w:sz="0" w:space="0" w:color="auto"/>
-                <w:left w:val="none" w:sz="0" w:space="0" w:color="auto"/>
-                <w:bottom w:val="none" w:sz="0" w:space="0" w:color="auto"/>
-                <w:right w:val="none" w:sz="0" w:space="0" w:color="auto"/>
-              </w:pBdr>
-              <w:tabs>
-                <w:tab w:val="center" w:pos="4324"/>
-              </w:tabs>
-              <w:spacing w:after="331" w:line="259" w:lineRule="auto"/>
-              <w:ind w:left="0" w:firstLine="0"/>
-            </w:pPr>
-          </w:p>
-        </w:tc>
-        <w:tc>
-          <w:tcPr>
-            <w:tcW w:w="3049" w:type="dxa"/>
+            <w:tcW w:w="1129" w:type="dxa"/>
+          </w:tcPr>
+          <w:p>
+            <w:pPr>
+              <w:pBdr>
+                <w:top w:val="none" w:sz="0" w:space="0" w:color="auto"/>
+                <w:left w:val="none" w:sz="0" w:space="0" w:color="auto"/>
+                <w:bottom w:val="none" w:sz="0" w:space="0" w:color="auto"/>
+                <w:right w:val="none" w:sz="0" w:space="0" w:color="auto"/>
+              </w:pBdr>
+              <w:tabs>
+                <w:tab w:val="center" w:pos="4324"/>
+              </w:tabs>
+              <w:spacing w:after="331" w:line="259" w:lineRule="auto"/>
+              <w:ind w:left="0" w:firstLine="0"/>
+            </w:pPr>
+            <w:r>
+              <w:t>26/1/2026</w:t>
+            </w:r>
+          </w:p>
+        </w:tc>
+        <w:tc>
+          <w:tcPr>
+            <w:tcW w:w="2366" w:type="dxa"/>
+          </w:tcPr>
+          <w:p>
+            <w:pPr>
+              <w:pBdr>
+                <w:top w:val="none" w:sz="0" w:space="0" w:color="auto"/>
+                <w:left w:val="none" w:sz="0" w:space="0" w:color="auto"/>
+                <w:bottom w:val="none" w:sz="0" w:space="0" w:color="auto"/>
+                <w:right w:val="none" w:sz="0" w:space="0" w:color="auto"/>
+              </w:pBdr>
+              <w:tabs>
+                <w:tab w:val="center" w:pos="4324"/>
+              </w:tabs>
+              <w:spacing w:after="331" w:line="259" w:lineRule="auto"/>
+              <w:ind w:left="0" w:firstLine="0"/>
+            </w:pPr>
+          </w:p>
+        </w:tc>
+        <w:tc>
+          <w:tcPr>
+            <w:tcW w:w="2885" w:type="dxa"/>
+          </w:tcPr>
+          <w:p>
+            <w:pPr>
+              <w:pBdr>
+                <w:top w:val="none" w:sz="0" w:space="0" w:color="auto"/>
+                <w:left w:val="none" w:sz="0" w:space="0" w:color="auto"/>
+                <w:bottom w:val="none" w:sz="0" w:space="0" w:color="auto"/>
+                <w:right w:val="none" w:sz="0" w:space="0" w:color="auto"/>
+              </w:pBdr>
+              <w:tabs>
+                <w:tab w:val="center" w:pos="4324"/>
+              </w:tabs>
+              <w:spacing w:after="331" w:line="259" w:lineRule="auto"/>
+              <w:ind w:left="0" w:firstLine="0"/>
+            </w:pPr>
+          </w:p>
+        </w:tc>
+        <w:tc>
+          <w:tcPr>
+            <w:tcW w:w="2956" w:type="dxa"/>
+          </w:tcPr>
+          <w:p>
+            <w:pPr>
+              <w:pBdr>
+                <w:top w:val="none" w:sz="0" w:space="0" w:color="auto"/>
+                <w:left w:val="none" w:sz="0" w:space="0" w:color="auto"/>
+                <w:bottom w:val="none" w:sz="0" w:space="0" w:color="auto"/>
+                <w:right w:val="none" w:sz="0" w:space="0" w:color="auto"/>
+              </w:pBdr>
+              <w:tabs>
+                <w:tab w:val="center" w:pos="4324"/>
+              </w:tabs>
+              <w:spacing w:after="331" w:line="259" w:lineRule="auto"/>
+              <w:ind w:left="0" w:firstLine="0"/>
+            </w:pPr>
+          </w:p>
+        </w:tc>
+      </w:tr>
+      <w:tr>
+        <w:tc>
+          <w:tcPr>
+            <w:tcW w:w="1129" w:type="dxa"/>
+          </w:tcPr>
+          <w:p>
+            <w:pPr>
+              <w:pBdr>
+                <w:top w:val="none" w:sz="0" w:space="0" w:color="auto"/>
+                <w:left w:val="none" w:sz="0" w:space="0" w:color="auto"/>
+                <w:bottom w:val="none" w:sz="0" w:space="0" w:color="auto"/>
+                <w:right w:val="none" w:sz="0" w:space="0" w:color="auto"/>
+              </w:pBdr>
+              <w:tabs>
+                <w:tab w:val="center" w:pos="4324"/>
+              </w:tabs>
+              <w:spacing w:after="331" w:line="259" w:lineRule="auto"/>
+              <w:ind w:left="0" w:firstLine="0"/>
+            </w:pPr>
+            <w:r>
+              <w:t>2/2/2026</w:t>
+            </w:r>
+          </w:p>
+        </w:tc>
+        <w:tc>
+          <w:tcPr>
+            <w:tcW w:w="2366" w:type="dxa"/>
+          </w:tcPr>
+          <w:p>
+            <w:pPr>
+              <w:pBdr>
+                <w:top w:val="none" w:sz="0" w:space="0" w:color="auto"/>
+                <w:left w:val="none" w:sz="0" w:space="0" w:color="auto"/>
+                <w:bottom w:val="none" w:sz="0" w:space="0" w:color="auto"/>
+                <w:right w:val="none" w:sz="0" w:space="0" w:color="auto"/>
+              </w:pBdr>
+              <w:tabs>
+                <w:tab w:val="center" w:pos="4324"/>
+              </w:tabs>
+              <w:spacing w:after="331" w:line="259" w:lineRule="auto"/>
+              <w:ind w:left="0" w:firstLine="0"/>
+            </w:pPr>
+            <w:proofErr w:type="spellStart"/>
+            <w:r>
+              <w:t>Abandones</w:t>
+            </w:r>
+            <w:proofErr w:type="spellEnd"/>
+            <w:r>
+              <w:t xml:space="preserve"> the </w:t>
+            </w:r>
+            <w:proofErr w:type="spellStart"/>
+            <w:r>
+              <w:t>CustomHYS</w:t>
+            </w:r>
+            <w:proofErr w:type="spellEnd"/>
+            <w:r>
+              <w:t xml:space="preserve"> framework after too many optimisation problems. </w:t>
+            </w:r>
+          </w:p>
+        </w:tc>
+        <w:tc>
+          <w:tcPr>
+            <w:tcW w:w="2885" w:type="dxa"/>
+          </w:tcPr>
+          <w:p>
+            <w:pPr>
+              <w:pBdr>
+                <w:top w:val="none" w:sz="0" w:space="0" w:color="auto"/>
+                <w:left w:val="none" w:sz="0" w:space="0" w:color="auto"/>
+                <w:bottom w:val="none" w:sz="0" w:space="0" w:color="auto"/>
+                <w:right w:val="none" w:sz="0" w:space="0" w:color="auto"/>
+              </w:pBdr>
+              <w:tabs>
+                <w:tab w:val="center" w:pos="4324"/>
+              </w:tabs>
+              <w:spacing w:after="331" w:line="259" w:lineRule="auto"/>
+              <w:ind w:left="0" w:firstLine="0"/>
+            </w:pPr>
+            <w:r>
+              <w:t xml:space="preserve">I had to rewrite my entire code from scratch. </w:t>
+            </w:r>
+          </w:p>
+        </w:tc>
+        <w:tc>
+          <w:tcPr>
+            <w:tcW w:w="2956" w:type="dxa"/>
+          </w:tcPr>
+          <w:p>
+            <w:pPr>
+              <w:pBdr>
+                <w:top w:val="none" w:sz="0" w:space="0" w:color="auto"/>
+                <w:left w:val="none" w:sz="0" w:space="0" w:color="auto"/>
+                <w:bottom w:val="none" w:sz="0" w:space="0" w:color="auto"/>
+                <w:right w:val="none" w:sz="0" w:space="0" w:color="auto"/>
+              </w:pBdr>
+              <w:tabs>
+                <w:tab w:val="center" w:pos="4324"/>
+              </w:tabs>
+              <w:spacing w:after="331" w:line="259" w:lineRule="auto"/>
+              <w:ind w:left="0" w:firstLine="0"/>
+            </w:pPr>
+            <w:r>
+              <w:t xml:space="preserve">Dedicate the whole week to coding my project to see if I could get a working base model of a </w:t>
+            </w:r>
+            <w:proofErr w:type="spellStart"/>
+            <w:r>
+              <w:t>hyperheuristic</w:t>
+            </w:r>
+            <w:proofErr w:type="spellEnd"/>
+          </w:p>
+        </w:tc>
+      </w:tr>
+      <w:tr>
+        <w:tc>
+          <w:tcPr>
+            <w:tcW w:w="1129" w:type="dxa"/>
+          </w:tcPr>
+          <w:p>
+            <w:pPr>
+              <w:pBdr>
+                <w:top w:val="none" w:sz="0" w:space="0" w:color="auto"/>
+                <w:left w:val="none" w:sz="0" w:space="0" w:color="auto"/>
+                <w:bottom w:val="none" w:sz="0" w:space="0" w:color="auto"/>
+                <w:right w:val="none" w:sz="0" w:space="0" w:color="auto"/>
+              </w:pBdr>
+              <w:tabs>
+                <w:tab w:val="center" w:pos="4324"/>
+              </w:tabs>
+              <w:spacing w:after="331" w:line="259" w:lineRule="auto"/>
+              <w:ind w:left="0" w:firstLine="0"/>
+            </w:pPr>
+            <w:r>
+              <w:t>12/2/2026</w:t>
+            </w:r>
+          </w:p>
+        </w:tc>
+        <w:tc>
+          <w:tcPr>
+            <w:tcW w:w="2366" w:type="dxa"/>
+          </w:tcPr>
+          <w:p>
+            <w:pPr>
+              <w:pBdr>
+                <w:top w:val="none" w:sz="0" w:space="0" w:color="auto"/>
+                <w:left w:val="none" w:sz="0" w:space="0" w:color="auto"/>
+                <w:bottom w:val="none" w:sz="0" w:space="0" w:color="auto"/>
+                <w:right w:val="none" w:sz="0" w:space="0" w:color="auto"/>
+              </w:pBdr>
+              <w:tabs>
+                <w:tab w:val="center" w:pos="4324"/>
+              </w:tabs>
+              <w:spacing w:after="331" w:line="259" w:lineRule="auto"/>
+              <w:ind w:left="0" w:firstLine="0"/>
+            </w:pPr>
+            <w:r>
+              <w:t>Successfully made a hyper-heuristic with that operates on Hyflex optimisation problems</w:t>
+            </w:r>
+          </w:p>
+        </w:tc>
+        <w:tc>
+          <w:tcPr>
+            <w:tcW w:w="2885" w:type="dxa"/>
+          </w:tcPr>
+          <w:p>
+            <w:pPr>
+              <w:pBdr>
+                <w:top w:val="none" w:sz="0" w:space="0" w:color="auto"/>
+                <w:left w:val="none" w:sz="0" w:space="0" w:color="auto"/>
+                <w:bottom w:val="none" w:sz="0" w:space="0" w:color="auto"/>
+                <w:right w:val="none" w:sz="0" w:space="0" w:color="auto"/>
+              </w:pBdr>
+              <w:tabs>
+                <w:tab w:val="center" w:pos="4324"/>
+              </w:tabs>
+              <w:spacing w:after="331" w:line="259" w:lineRule="auto"/>
+              <w:ind w:left="0" w:firstLine="0"/>
+            </w:pPr>
+          </w:p>
+        </w:tc>
+        <w:tc>
+          <w:tcPr>
+            <w:tcW w:w="2956" w:type="dxa"/>
+          </w:tcPr>
+          <w:p>
+            <w:pPr>
+              <w:pBdr>
+                <w:top w:val="none" w:sz="0" w:space="0" w:color="auto"/>
+                <w:left w:val="none" w:sz="0" w:space="0" w:color="auto"/>
+                <w:bottom w:val="none" w:sz="0" w:space="0" w:color="auto"/>
+                <w:right w:val="none" w:sz="0" w:space="0" w:color="auto"/>
+              </w:pBdr>
+              <w:tabs>
+                <w:tab w:val="center" w:pos="4324"/>
+              </w:tabs>
+              <w:spacing w:after="331" w:line="259" w:lineRule="auto"/>
+              <w:ind w:left="0" w:firstLine="0"/>
+            </w:pPr>
+            <w:r>
+              <w:t>Asked David (supervisor) for 2 weeks off to focus on coursework deadlines for other modules</w:t>
+            </w:r>
+          </w:p>
+        </w:tc>
+      </w:tr>
+      <w:tr>
+        <w:tc>
+          <w:tcPr>
+            <w:tcW w:w="1129" w:type="dxa"/>
+          </w:tcPr>
+          <w:p>
+            <w:pPr>
+              <w:pBdr>
+                <w:top w:val="none" w:sz="0" w:space="0" w:color="auto"/>
+                <w:left w:val="none" w:sz="0" w:space="0" w:color="auto"/>
+                <w:bottom w:val="none" w:sz="0" w:space="0" w:color="auto"/>
+                <w:right w:val="none" w:sz="0" w:space="0" w:color="auto"/>
+              </w:pBdr>
+              <w:tabs>
+                <w:tab w:val="center" w:pos="4324"/>
+              </w:tabs>
+              <w:spacing w:after="331" w:line="259" w:lineRule="auto"/>
+              <w:ind w:left="0" w:firstLine="0"/>
+            </w:pPr>
+            <w:r>
+              <w:t>16/2/2026</w:t>
+            </w:r>
+          </w:p>
+        </w:tc>
+        <w:tc>
+          <w:tcPr>
+            <w:tcW w:w="2366" w:type="dxa"/>
+          </w:tcPr>
+          <w:p>
+            <w:pPr>
+              <w:pBdr>
+                <w:top w:val="none" w:sz="0" w:space="0" w:color="auto"/>
+                <w:left w:val="none" w:sz="0" w:space="0" w:color="auto"/>
+                <w:bottom w:val="none" w:sz="0" w:space="0" w:color="auto"/>
+                <w:right w:val="none" w:sz="0" w:space="0" w:color="auto"/>
+              </w:pBdr>
+              <w:tabs>
+                <w:tab w:val="center" w:pos="4324"/>
+              </w:tabs>
+              <w:spacing w:after="331" w:line="259" w:lineRule="auto"/>
+              <w:ind w:left="0" w:firstLine="0"/>
+            </w:pPr>
+            <w:r>
+              <w:t>Made no progress with project, focussed on coursework</w:t>
+            </w:r>
+          </w:p>
+        </w:tc>
+        <w:tc>
+          <w:tcPr>
+            <w:tcW w:w="2885" w:type="dxa"/>
+          </w:tcPr>
+          <w:p>
+            <w:pPr>
+              <w:pBdr>
+                <w:top w:val="none" w:sz="0" w:space="0" w:color="auto"/>
+                <w:left w:val="none" w:sz="0" w:space="0" w:color="auto"/>
+                <w:bottom w:val="none" w:sz="0" w:space="0" w:color="auto"/>
+                <w:right w:val="none" w:sz="0" w:space="0" w:color="auto"/>
+              </w:pBdr>
+              <w:tabs>
+                <w:tab w:val="center" w:pos="4324"/>
+              </w:tabs>
+              <w:spacing w:after="331" w:line="259" w:lineRule="auto"/>
+              <w:ind w:left="0" w:firstLine="0"/>
+            </w:pPr>
+            <w:r>
+              <w:t xml:space="preserve">I was able to submit my coursework in time; </w:t>
+            </w:r>
+            <w:r>
+              <w:t>however,</w:t>
+            </w:r>
+            <w:r>
+              <w:t xml:space="preserve"> I had to do 2 more for the next upcoming weeks</w:t>
+            </w:r>
+          </w:p>
+        </w:tc>
+        <w:tc>
+          <w:tcPr>
+            <w:tcW w:w="2956" w:type="dxa"/>
+          </w:tcPr>
+          <w:p>
+            <w:pPr>
+              <w:pBdr>
+                <w:top w:val="none" w:sz="0" w:space="0" w:color="auto"/>
+                <w:left w:val="none" w:sz="0" w:space="0" w:color="auto"/>
+                <w:bottom w:val="none" w:sz="0" w:space="0" w:color="auto"/>
+                <w:right w:val="none" w:sz="0" w:space="0" w:color="auto"/>
+              </w:pBdr>
+              <w:tabs>
+                <w:tab w:val="center" w:pos="4324"/>
+              </w:tabs>
+              <w:spacing w:after="331" w:line="259" w:lineRule="auto"/>
+              <w:ind w:left="0" w:firstLine="0"/>
+            </w:pPr>
+            <w:r>
+              <w:t>No major comment needed</w:t>
+            </w:r>
+          </w:p>
+        </w:tc>
+      </w:tr>
+      <w:tr>
+        <w:tc>
+          <w:tcPr>
+            <w:tcW w:w="1129" w:type="dxa"/>
+          </w:tcPr>
+          <w:p>
+            <w:pPr>
+              <w:pBdr>
+                <w:top w:val="none" w:sz="0" w:space="0" w:color="auto"/>
+                <w:left w:val="none" w:sz="0" w:space="0" w:color="auto"/>
+                <w:bottom w:val="none" w:sz="0" w:space="0" w:color="auto"/>
+                <w:right w:val="none" w:sz="0" w:space="0" w:color="auto"/>
+              </w:pBdr>
+              <w:tabs>
+                <w:tab w:val="center" w:pos="4324"/>
+              </w:tabs>
+              <w:spacing w:after="331" w:line="259" w:lineRule="auto"/>
+              <w:ind w:left="0" w:firstLine="0"/>
+            </w:pPr>
+            <w:r>
+              <w:t>25/2/2026</w:t>
+            </w:r>
+          </w:p>
+        </w:tc>
+        <w:tc>
+          <w:tcPr>
+            <w:tcW w:w="2366" w:type="dxa"/>
+          </w:tcPr>
+          <w:p>
+            <w:pPr>
+              <w:pBdr>
+                <w:top w:val="none" w:sz="0" w:space="0" w:color="auto"/>
+                <w:left w:val="none" w:sz="0" w:space="0" w:color="auto"/>
+                <w:bottom w:val="none" w:sz="0" w:space="0" w:color="auto"/>
+                <w:right w:val="none" w:sz="0" w:space="0" w:color="auto"/>
+              </w:pBdr>
+              <w:tabs>
+                <w:tab w:val="center" w:pos="4324"/>
+              </w:tabs>
+              <w:spacing w:after="331" w:line="259" w:lineRule="auto"/>
+              <w:ind w:left="0" w:firstLine="0"/>
+            </w:pPr>
+            <w:r>
+              <w:t xml:space="preserve">Made a start with report headers, </w:t>
+            </w:r>
+          </w:p>
+        </w:tc>
+        <w:tc>
+          <w:tcPr>
+            <w:tcW w:w="2885" w:type="dxa"/>
+          </w:tcPr>
+          <w:p>
+            <w:pPr>
+              <w:pBdr>
+                <w:top w:val="none" w:sz="0" w:space="0" w:color="auto"/>
+                <w:left w:val="none" w:sz="0" w:space="0" w:color="auto"/>
+                <w:bottom w:val="none" w:sz="0" w:space="0" w:color="auto"/>
+                <w:right w:val="none" w:sz="0" w:space="0" w:color="auto"/>
+              </w:pBdr>
+              <w:tabs>
+                <w:tab w:val="center" w:pos="4324"/>
+              </w:tabs>
+              <w:spacing w:after="331" w:line="259" w:lineRule="auto"/>
+              <w:ind w:left="0" w:firstLine="0"/>
+            </w:pPr>
+          </w:p>
+        </w:tc>
+        <w:tc>
+          <w:tcPr>
+            <w:tcW w:w="2956" w:type="dxa"/>
+          </w:tcPr>
+          <w:p>
+            <w:pPr>
+              <w:pBdr>
+                <w:top w:val="none" w:sz="0" w:space="0" w:color="auto"/>
+                <w:left w:val="none" w:sz="0" w:space="0" w:color="auto"/>
+                <w:bottom w:val="none" w:sz="0" w:space="0" w:color="auto"/>
+                <w:right w:val="none" w:sz="0" w:space="0" w:color="auto"/>
+              </w:pBdr>
+              <w:tabs>
+                <w:tab w:val="center" w:pos="4324"/>
+              </w:tabs>
+              <w:spacing w:after="331" w:line="259" w:lineRule="auto"/>
+              <w:ind w:left="0" w:firstLine="0"/>
+            </w:pPr>
+          </w:p>
+        </w:tc>
+      </w:tr>
+      <w:tr>
+        <w:tc>
+          <w:tcPr>
+            <w:tcW w:w="1129" w:type="dxa"/>
+          </w:tcPr>
+          <w:p>
+            <w:pPr>
+              <w:pBdr>
+                <w:top w:val="none" w:sz="0" w:space="0" w:color="auto"/>
+                <w:left w:val="none" w:sz="0" w:space="0" w:color="auto"/>
+                <w:bottom w:val="none" w:sz="0" w:space="0" w:color="auto"/>
+                <w:right w:val="none" w:sz="0" w:space="0" w:color="auto"/>
+              </w:pBdr>
+              <w:tabs>
+                <w:tab w:val="center" w:pos="4324"/>
+              </w:tabs>
+              <w:spacing w:after="331" w:line="259" w:lineRule="auto"/>
+              <w:ind w:left="0" w:firstLine="0"/>
+            </w:pPr>
+            <w:r>
+              <w:t>4/3/2026</w:t>
+            </w:r>
+          </w:p>
+        </w:tc>
+        <w:tc>
+          <w:tcPr>
+            <w:tcW w:w="2366" w:type="dxa"/>
+          </w:tcPr>
+          <w:p>
+            <w:pPr>
+              <w:pBdr>
+                <w:top w:val="none" w:sz="0" w:space="0" w:color="auto"/>
+                <w:left w:val="none" w:sz="0" w:space="0" w:color="auto"/>
+                <w:bottom w:val="none" w:sz="0" w:space="0" w:color="auto"/>
+                <w:right w:val="none" w:sz="0" w:space="0" w:color="auto"/>
+              </w:pBdr>
+              <w:tabs>
+                <w:tab w:val="center" w:pos="4324"/>
+              </w:tabs>
+              <w:spacing w:after="331" w:line="259" w:lineRule="auto"/>
+              <w:ind w:left="0" w:firstLine="0"/>
+            </w:pPr>
+          </w:p>
+        </w:tc>
+        <w:tc>
+          <w:tcPr>
+            <w:tcW w:w="2885" w:type="dxa"/>
+          </w:tcPr>
+          <w:p>
+            <w:pPr>
+              <w:pBdr>
+                <w:top w:val="none" w:sz="0" w:space="0" w:color="auto"/>
+                <w:left w:val="none" w:sz="0" w:space="0" w:color="auto"/>
+                <w:bottom w:val="none" w:sz="0" w:space="0" w:color="auto"/>
+                <w:right w:val="none" w:sz="0" w:space="0" w:color="auto"/>
+              </w:pBdr>
+              <w:tabs>
+                <w:tab w:val="center" w:pos="4324"/>
+              </w:tabs>
+              <w:spacing w:after="331" w:line="259" w:lineRule="auto"/>
+              <w:ind w:left="0" w:firstLine="0"/>
+            </w:pPr>
+          </w:p>
+        </w:tc>
+        <w:tc>
+          <w:tcPr>
+            <w:tcW w:w="2956" w:type="dxa"/>
+          </w:tcPr>
+          <w:p>
+            <w:pPr>
+              <w:pBdr>
+                <w:top w:val="none" w:sz="0" w:space="0" w:color="auto"/>
+                <w:left w:val="none" w:sz="0" w:space="0" w:color="auto"/>
+                <w:bottom w:val="none" w:sz="0" w:space="0" w:color="auto"/>
+                <w:right w:val="none" w:sz="0" w:space="0" w:color="auto"/>
+              </w:pBdr>
+              <w:tabs>
+                <w:tab w:val="center" w:pos="4324"/>
+              </w:tabs>
+              <w:spacing w:after="331" w:line="259" w:lineRule="auto"/>
+              <w:ind w:left="0" w:firstLine="0"/>
+            </w:pPr>
+          </w:p>
+        </w:tc>
+      </w:tr>
+      <w:tr>
+        <w:tc>
+          <w:tcPr>
+            <w:tcW w:w="1129" w:type="dxa"/>
+          </w:tcPr>
+          <w:p>
+            <w:pPr>
+              <w:pBdr>
+                <w:top w:val="none" w:sz="0" w:space="0" w:color="auto"/>
+                <w:left w:val="none" w:sz="0" w:space="0" w:color="auto"/>
+                <w:bottom w:val="none" w:sz="0" w:space="0" w:color="auto"/>
+                <w:right w:val="none" w:sz="0" w:space="0" w:color="auto"/>
+              </w:pBdr>
+              <w:tabs>
+                <w:tab w:val="center" w:pos="4324"/>
+              </w:tabs>
+              <w:spacing w:after="331" w:line="259" w:lineRule="auto"/>
+              <w:ind w:left="0" w:firstLine="0"/>
+            </w:pPr>
+          </w:p>
+        </w:tc>
+        <w:tc>
+          <w:tcPr>
+            <w:tcW w:w="2366" w:type="dxa"/>
+          </w:tcPr>
+          <w:p>
+            <w:pPr>
+              <w:pBdr>
+                <w:top w:val="none" w:sz="0" w:space="0" w:color="auto"/>
+                <w:left w:val="none" w:sz="0" w:space="0" w:color="auto"/>
+                <w:bottom w:val="none" w:sz="0" w:space="0" w:color="auto"/>
+                <w:right w:val="none" w:sz="0" w:space="0" w:color="auto"/>
+              </w:pBdr>
+              <w:tabs>
+                <w:tab w:val="center" w:pos="4324"/>
+              </w:tabs>
+              <w:spacing w:after="331" w:line="259" w:lineRule="auto"/>
+              <w:ind w:left="0" w:firstLine="0"/>
+            </w:pPr>
+          </w:p>
+        </w:tc>
+        <w:tc>
+          <w:tcPr>
+            <w:tcW w:w="2885" w:type="dxa"/>
+          </w:tcPr>
+          <w:p>
+            <w:pPr>
+              <w:pBdr>
+                <w:top w:val="none" w:sz="0" w:space="0" w:color="auto"/>
+                <w:left w:val="none" w:sz="0" w:space="0" w:color="auto"/>
+                <w:bottom w:val="none" w:sz="0" w:space="0" w:color="auto"/>
+                <w:right w:val="none" w:sz="0" w:space="0" w:color="auto"/>
+              </w:pBdr>
+              <w:tabs>
+                <w:tab w:val="center" w:pos="4324"/>
+              </w:tabs>
+              <w:spacing w:after="331" w:line="259" w:lineRule="auto"/>
+              <w:ind w:left="0" w:firstLine="0"/>
+            </w:pPr>
+          </w:p>
+        </w:tc>
+        <w:tc>
+          <w:tcPr>
+            <w:tcW w:w="2956" w:type="dxa"/>
+          </w:tcPr>
+          <w:p>
+            <w:pPr>
+              <w:pBdr>
+                <w:top w:val="none" w:sz="0" w:space="0" w:color="auto"/>
+                <w:left w:val="none" w:sz="0" w:space="0" w:color="auto"/>
+                <w:bottom w:val="none" w:sz="0" w:space="0" w:color="auto"/>
+                <w:right w:val="none" w:sz="0" w:space="0" w:color="auto"/>
+              </w:pBdr>
+              <w:tabs>
+                <w:tab w:val="center" w:pos="4324"/>
+              </w:tabs>
+              <w:spacing w:after="331" w:line="259" w:lineRule="auto"/>
+              <w:ind w:left="0" w:firstLine="0"/>
+            </w:pPr>
+          </w:p>
+        </w:tc>
+      </w:tr>
+      <w:tr>
+        <w:tc>
+          <w:tcPr>
+            <w:tcW w:w="1129" w:type="dxa"/>
+          </w:tcPr>
+          <w:p>
+            <w:pPr>
+              <w:pBdr>
+                <w:top w:val="none" w:sz="0" w:space="0" w:color="auto"/>
+                <w:left w:val="none" w:sz="0" w:space="0" w:color="auto"/>
+                <w:bottom w:val="none" w:sz="0" w:space="0" w:color="auto"/>
+                <w:right w:val="none" w:sz="0" w:space="0" w:color="auto"/>
+              </w:pBdr>
+              <w:tabs>
+                <w:tab w:val="center" w:pos="4324"/>
+              </w:tabs>
+              <w:spacing w:after="331" w:line="259" w:lineRule="auto"/>
+              <w:ind w:left="0" w:firstLine="0"/>
+            </w:pPr>
+          </w:p>
+        </w:tc>
+        <w:tc>
+          <w:tcPr>
+            <w:tcW w:w="2366" w:type="dxa"/>
+          </w:tcPr>
+          <w:p>
+            <w:pPr>
+              <w:pBdr>
+                <w:top w:val="none" w:sz="0" w:space="0" w:color="auto"/>
+                <w:left w:val="none" w:sz="0" w:space="0" w:color="auto"/>
+                <w:bottom w:val="none" w:sz="0" w:space="0" w:color="auto"/>
+                <w:right w:val="none" w:sz="0" w:space="0" w:color="auto"/>
+              </w:pBdr>
+              <w:tabs>
+                <w:tab w:val="center" w:pos="4324"/>
+              </w:tabs>
+              <w:spacing w:after="331" w:line="259" w:lineRule="auto"/>
+              <w:ind w:left="0" w:firstLine="0"/>
+            </w:pPr>
+          </w:p>
+        </w:tc>
+        <w:tc>
+          <w:tcPr>
+            <w:tcW w:w="2885" w:type="dxa"/>
+          </w:tcPr>
+          <w:p>
+            <w:pPr>
+              <w:pBdr>
+                <w:top w:val="none" w:sz="0" w:space="0" w:color="auto"/>
+                <w:left w:val="none" w:sz="0" w:space="0" w:color="auto"/>
+                <w:bottom w:val="none" w:sz="0" w:space="0" w:color="auto"/>
+                <w:right w:val="none" w:sz="0" w:space="0" w:color="auto"/>
+              </w:pBdr>
+              <w:tabs>
+                <w:tab w:val="center" w:pos="4324"/>
+              </w:tabs>
+              <w:spacing w:after="331" w:line="259" w:lineRule="auto"/>
+              <w:ind w:left="0" w:firstLine="0"/>
+            </w:pPr>
+          </w:p>
+        </w:tc>
+        <w:tc>
+          <w:tcPr>
+            <w:tcW w:w="2956" w:type="dxa"/>
+          </w:tcPr>
+          <w:p>
+            <w:pPr>
+              <w:pBdr>
+                <w:top w:val="none" w:sz="0" w:space="0" w:color="auto"/>
+                <w:left w:val="none" w:sz="0" w:space="0" w:color="auto"/>
+                <w:bottom w:val="none" w:sz="0" w:space="0" w:color="auto"/>
+                <w:right w:val="none" w:sz="0" w:space="0" w:color="auto"/>
+              </w:pBdr>
+              <w:tabs>
+                <w:tab w:val="center" w:pos="4324"/>
+              </w:tabs>
+              <w:spacing w:after="331" w:line="259" w:lineRule="auto"/>
+              <w:ind w:left="0" w:firstLine="0"/>
+            </w:pPr>
+          </w:p>
+        </w:tc>
+      </w:tr>
+      <w:tr>
+        <w:tc>
+          <w:tcPr>
+            <w:tcW w:w="1129" w:type="dxa"/>
+          </w:tcPr>
+          <w:p>
+            <w:pPr>
+              <w:pBdr>
+                <w:top w:val="none" w:sz="0" w:space="0" w:color="auto"/>
+                <w:left w:val="none" w:sz="0" w:space="0" w:color="auto"/>
+                <w:bottom w:val="none" w:sz="0" w:space="0" w:color="auto"/>
+                <w:right w:val="none" w:sz="0" w:space="0" w:color="auto"/>
+              </w:pBdr>
+              <w:tabs>
+                <w:tab w:val="center" w:pos="4324"/>
+              </w:tabs>
+              <w:spacing w:after="331" w:line="259" w:lineRule="auto"/>
+              <w:ind w:left="0" w:firstLine="0"/>
+            </w:pPr>
+          </w:p>
+        </w:tc>
+        <w:tc>
+          <w:tcPr>
+            <w:tcW w:w="2366" w:type="dxa"/>
+          </w:tcPr>
+          <w:p>
+            <w:pPr>
+              <w:pBdr>
+                <w:top w:val="none" w:sz="0" w:space="0" w:color="auto"/>
+                <w:left w:val="none" w:sz="0" w:space="0" w:color="auto"/>
+                <w:bottom w:val="none" w:sz="0" w:space="0" w:color="auto"/>
+                <w:right w:val="none" w:sz="0" w:space="0" w:color="auto"/>
+              </w:pBdr>
+              <w:tabs>
+                <w:tab w:val="center" w:pos="4324"/>
+              </w:tabs>
+              <w:spacing w:after="331" w:line="259" w:lineRule="auto"/>
+              <w:ind w:left="0" w:firstLine="0"/>
+            </w:pPr>
+          </w:p>
+        </w:tc>
+        <w:tc>
+          <w:tcPr>
+            <w:tcW w:w="2885" w:type="dxa"/>
+          </w:tcPr>
+          <w:p>
+            <w:pPr>
+              <w:pBdr>
+                <w:top w:val="none" w:sz="0" w:space="0" w:color="auto"/>
+                <w:left w:val="none" w:sz="0" w:space="0" w:color="auto"/>
+                <w:bottom w:val="none" w:sz="0" w:space="0" w:color="auto"/>
+                <w:right w:val="none" w:sz="0" w:space="0" w:color="auto"/>
+              </w:pBdr>
+              <w:tabs>
+                <w:tab w:val="center" w:pos="4324"/>
+              </w:tabs>
+              <w:spacing w:after="331" w:line="259" w:lineRule="auto"/>
+              <w:ind w:left="0" w:firstLine="0"/>
+            </w:pPr>
+          </w:p>
+        </w:tc>
+        <w:tc>
+          <w:tcPr>
+            <w:tcW w:w="2956" w:type="dxa"/>
+          </w:tcPr>
+          <w:p>
+            <w:pPr>
+              <w:pBdr>
+                <w:top w:val="none" w:sz="0" w:space="0" w:color="auto"/>
+                <w:left w:val="none" w:sz="0" w:space="0" w:color="auto"/>
+                <w:bottom w:val="none" w:sz="0" w:space="0" w:color="auto"/>
+                <w:right w:val="none" w:sz="0" w:space="0" w:color="auto"/>
+              </w:pBdr>
+              <w:tabs>
+                <w:tab w:val="center" w:pos="4324"/>
+              </w:tabs>
+              <w:spacing w:after="331" w:line="259" w:lineRule="auto"/>
+              <w:ind w:left="0" w:firstLine="0"/>
+            </w:pPr>
+          </w:p>
+        </w:tc>
+      </w:tr>
+      <w:tr>
+        <w:tc>
+          <w:tcPr>
+            <w:tcW w:w="1129" w:type="dxa"/>
+          </w:tcPr>
+          <w:p>
+            <w:pPr>
+              <w:pBdr>
+                <w:top w:val="none" w:sz="0" w:space="0" w:color="auto"/>
+                <w:left w:val="none" w:sz="0" w:space="0" w:color="auto"/>
+                <w:bottom w:val="none" w:sz="0" w:space="0" w:color="auto"/>
+                <w:right w:val="none" w:sz="0" w:space="0" w:color="auto"/>
+              </w:pBdr>
+              <w:tabs>
+                <w:tab w:val="center" w:pos="4324"/>
+              </w:tabs>
+              <w:spacing w:after="331" w:line="259" w:lineRule="auto"/>
+              <w:ind w:left="0" w:firstLine="0"/>
+            </w:pPr>
+          </w:p>
+        </w:tc>
+        <w:tc>
+          <w:tcPr>
+            <w:tcW w:w="2366" w:type="dxa"/>
+          </w:tcPr>
+          <w:p>
+            <w:pPr>
+              <w:pBdr>
+                <w:top w:val="none" w:sz="0" w:space="0" w:color="auto"/>
+                <w:left w:val="none" w:sz="0" w:space="0" w:color="auto"/>
+                <w:bottom w:val="none" w:sz="0" w:space="0" w:color="auto"/>
+                <w:right w:val="none" w:sz="0" w:space="0" w:color="auto"/>
+              </w:pBdr>
+              <w:tabs>
+                <w:tab w:val="center" w:pos="4324"/>
+              </w:tabs>
+              <w:spacing w:after="331" w:line="259" w:lineRule="auto"/>
+              <w:ind w:left="0" w:firstLine="0"/>
+            </w:pPr>
+          </w:p>
+        </w:tc>
+        <w:tc>
+          <w:tcPr>
+            <w:tcW w:w="2885" w:type="dxa"/>
+          </w:tcPr>
+          <w:p>
+            <w:pPr>
+              <w:pBdr>
+                <w:top w:val="none" w:sz="0" w:space="0" w:color="auto"/>
+                <w:left w:val="none" w:sz="0" w:space="0" w:color="auto"/>
+                <w:bottom w:val="none" w:sz="0" w:space="0" w:color="auto"/>
+                <w:right w:val="none" w:sz="0" w:space="0" w:color="auto"/>
+              </w:pBdr>
+              <w:tabs>
+                <w:tab w:val="center" w:pos="4324"/>
+              </w:tabs>
+              <w:spacing w:after="331" w:line="259" w:lineRule="auto"/>
+              <w:ind w:left="0" w:firstLine="0"/>
+            </w:pPr>
+          </w:p>
+        </w:tc>
+        <w:tc>
+          <w:tcPr>
+            <w:tcW w:w="2956" w:type="dxa"/>
+          </w:tcPr>
+          <w:p>
+            <w:pPr>
+              <w:pBdr>
+                <w:top w:val="none" w:sz="0" w:space="0" w:color="auto"/>
+                <w:left w:val="none" w:sz="0" w:space="0" w:color="auto"/>
+                <w:bottom w:val="none" w:sz="0" w:space="0" w:color="auto"/>
+                <w:right w:val="none" w:sz="0" w:space="0" w:color="auto"/>
+              </w:pBdr>
+              <w:tabs>
+                <w:tab w:val="center" w:pos="4324"/>
+              </w:tabs>
+              <w:spacing w:after="331" w:line="259" w:lineRule="auto"/>
+              <w:ind w:left="0" w:firstLine="0"/>
+            </w:pPr>
+          </w:p>
+        </w:tc>
+      </w:tr>
+      <w:tr>
+        <w:tc>
+          <w:tcPr>
+            <w:tcW w:w="1129" w:type="dxa"/>
+          </w:tcPr>
+          <w:p>
+            <w:pPr>
+              <w:pBdr>
+                <w:top w:val="none" w:sz="0" w:space="0" w:color="auto"/>
+                <w:left w:val="none" w:sz="0" w:space="0" w:color="auto"/>
+                <w:bottom w:val="none" w:sz="0" w:space="0" w:color="auto"/>
+                <w:right w:val="none" w:sz="0" w:space="0" w:color="auto"/>
+              </w:pBdr>
+              <w:tabs>
+                <w:tab w:val="center" w:pos="4324"/>
+              </w:tabs>
+              <w:spacing w:after="331" w:line="259" w:lineRule="auto"/>
+              <w:ind w:left="0" w:firstLine="0"/>
+            </w:pPr>
+          </w:p>
+        </w:tc>
+        <w:tc>
+          <w:tcPr>
+            <w:tcW w:w="2366" w:type="dxa"/>
+          </w:tcPr>
+          <w:p>
+            <w:pPr>
+              <w:pBdr>
+                <w:top w:val="none" w:sz="0" w:space="0" w:color="auto"/>
+                <w:left w:val="none" w:sz="0" w:space="0" w:color="auto"/>
+                <w:bottom w:val="none" w:sz="0" w:space="0" w:color="auto"/>
+                <w:right w:val="none" w:sz="0" w:space="0" w:color="auto"/>
+              </w:pBdr>
+              <w:tabs>
+                <w:tab w:val="center" w:pos="4324"/>
+              </w:tabs>
+              <w:spacing w:after="331" w:line="259" w:lineRule="auto"/>
+              <w:ind w:left="0" w:firstLine="0"/>
+            </w:pPr>
+          </w:p>
+        </w:tc>
+        <w:tc>
+          <w:tcPr>
+            <w:tcW w:w="2885" w:type="dxa"/>
+          </w:tcPr>
+          <w:p>
+            <w:pPr>
+              <w:pBdr>
+                <w:top w:val="none" w:sz="0" w:space="0" w:color="auto"/>
+                <w:left w:val="none" w:sz="0" w:space="0" w:color="auto"/>
+                <w:bottom w:val="none" w:sz="0" w:space="0" w:color="auto"/>
+                <w:right w:val="none" w:sz="0" w:space="0" w:color="auto"/>
+              </w:pBdr>
+              <w:tabs>
+                <w:tab w:val="center" w:pos="4324"/>
+              </w:tabs>
+              <w:spacing w:after="331" w:line="259" w:lineRule="auto"/>
+              <w:ind w:left="0" w:firstLine="0"/>
+            </w:pPr>
+          </w:p>
+        </w:tc>
+        <w:tc>
+          <w:tcPr>
+            <w:tcW w:w="2956" w:type="dxa"/>
+          </w:tcPr>
+          <w:p>
+            <w:pPr>
+              <w:pBdr>
+                <w:top w:val="none" w:sz="0" w:space="0" w:color="auto"/>
+                <w:left w:val="none" w:sz="0" w:space="0" w:color="auto"/>
+                <w:bottom w:val="none" w:sz="0" w:space="0" w:color="auto"/>
+                <w:right w:val="none" w:sz="0" w:space="0" w:color="auto"/>
+              </w:pBdr>
+              <w:tabs>
+                <w:tab w:val="center" w:pos="4324"/>
+              </w:tabs>
+              <w:spacing w:after="331" w:line="259" w:lineRule="auto"/>
+              <w:ind w:left="0" w:firstLine="0"/>
+            </w:pPr>
+          </w:p>
+        </w:tc>
+      </w:tr>
+      <w:tr>
+        <w:tc>
+          <w:tcPr>
+            <w:tcW w:w="1129" w:type="dxa"/>
+          </w:tcPr>
+          <w:p>
+            <w:pPr>
+              <w:pBdr>
+                <w:top w:val="none" w:sz="0" w:space="0" w:color="auto"/>
+                <w:left w:val="none" w:sz="0" w:space="0" w:color="auto"/>
+                <w:bottom w:val="none" w:sz="0" w:space="0" w:color="auto"/>
+                <w:right w:val="none" w:sz="0" w:space="0" w:color="auto"/>
+              </w:pBdr>
+              <w:tabs>
+                <w:tab w:val="center" w:pos="4324"/>
+              </w:tabs>
+              <w:spacing w:after="331" w:line="259" w:lineRule="auto"/>
+              <w:ind w:left="0" w:firstLine="0"/>
+            </w:pPr>
+          </w:p>
+        </w:tc>
+        <w:tc>
+          <w:tcPr>
+            <w:tcW w:w="2366" w:type="dxa"/>
+          </w:tcPr>
+          <w:p>
+            <w:pPr>
+              <w:pBdr>
+                <w:top w:val="none" w:sz="0" w:space="0" w:color="auto"/>
+                <w:left w:val="none" w:sz="0" w:space="0" w:color="auto"/>
+                <w:bottom w:val="none" w:sz="0" w:space="0" w:color="auto"/>
+                <w:right w:val="none" w:sz="0" w:space="0" w:color="auto"/>
+              </w:pBdr>
+              <w:tabs>
+                <w:tab w:val="center" w:pos="4324"/>
+              </w:tabs>
+              <w:spacing w:after="331" w:line="259" w:lineRule="auto"/>
+              <w:ind w:left="0" w:firstLine="0"/>
+            </w:pPr>
+          </w:p>
+        </w:tc>
+        <w:tc>
+          <w:tcPr>
+            <w:tcW w:w="2885" w:type="dxa"/>
+          </w:tcPr>
+          <w:p>
+            <w:pPr>
+              <w:pBdr>
+                <w:top w:val="none" w:sz="0" w:space="0" w:color="auto"/>
+                <w:left w:val="none" w:sz="0" w:space="0" w:color="auto"/>
+                <w:bottom w:val="none" w:sz="0" w:space="0" w:color="auto"/>
+                <w:right w:val="none" w:sz="0" w:space="0" w:color="auto"/>
+              </w:pBdr>
+              <w:tabs>
+                <w:tab w:val="center" w:pos="4324"/>
+              </w:tabs>
+              <w:spacing w:after="331" w:line="259" w:lineRule="auto"/>
+              <w:ind w:left="0" w:firstLine="0"/>
+            </w:pPr>
+          </w:p>
+        </w:tc>
+        <w:tc>
+          <w:tcPr>
+            <w:tcW w:w="2956" w:type="dxa"/>
+          </w:tcPr>
+          <w:p>
+            <w:pPr>
+              <w:pBdr>
+                <w:top w:val="none" w:sz="0" w:space="0" w:color="auto"/>
+                <w:left w:val="none" w:sz="0" w:space="0" w:color="auto"/>
+                <w:bottom w:val="none" w:sz="0" w:space="0" w:color="auto"/>
+                <w:right w:val="none" w:sz="0" w:space="0" w:color="auto"/>
+              </w:pBdr>
+              <w:tabs>
+                <w:tab w:val="center" w:pos="4324"/>
+              </w:tabs>
+              <w:spacing w:after="331" w:line="259" w:lineRule="auto"/>
+              <w:ind w:left="0" w:firstLine="0"/>
+            </w:pPr>
+          </w:p>
+        </w:tc>
+      </w:tr>
+      <w:tr>
+        <w:tc>
+          <w:tcPr>
+            <w:tcW w:w="1129" w:type="dxa"/>
+          </w:tcPr>
+          <w:p>
+            <w:pPr>
+              <w:pBdr>
+                <w:top w:val="none" w:sz="0" w:space="0" w:color="auto"/>
+                <w:left w:val="none" w:sz="0" w:space="0" w:color="auto"/>
+                <w:bottom w:val="none" w:sz="0" w:space="0" w:color="auto"/>
+                <w:right w:val="none" w:sz="0" w:space="0" w:color="auto"/>
+              </w:pBdr>
+              <w:tabs>
+                <w:tab w:val="center" w:pos="4324"/>
+              </w:tabs>
+              <w:spacing w:after="331" w:line="259" w:lineRule="auto"/>
+              <w:ind w:left="0" w:firstLine="0"/>
+            </w:pPr>
+          </w:p>
+        </w:tc>
+        <w:tc>
+          <w:tcPr>
+            <w:tcW w:w="2366" w:type="dxa"/>
+          </w:tcPr>
+          <w:p>
+            <w:pPr>
+              <w:pBdr>
+                <w:top w:val="none" w:sz="0" w:space="0" w:color="auto"/>
+                <w:left w:val="none" w:sz="0" w:space="0" w:color="auto"/>
+                <w:bottom w:val="none" w:sz="0" w:space="0" w:color="auto"/>
+                <w:right w:val="none" w:sz="0" w:space="0" w:color="auto"/>
+              </w:pBdr>
+              <w:tabs>
+                <w:tab w:val="center" w:pos="4324"/>
+              </w:tabs>
+              <w:spacing w:after="331" w:line="259" w:lineRule="auto"/>
+              <w:ind w:left="0" w:firstLine="0"/>
+            </w:pPr>
+          </w:p>
+        </w:tc>
+        <w:tc>
+          <w:tcPr>
+            <w:tcW w:w="2885" w:type="dxa"/>
+          </w:tcPr>
+          <w:p>
+            <w:pPr>
+              <w:pBdr>
+                <w:top w:val="none" w:sz="0" w:space="0" w:color="auto"/>
+                <w:left w:val="none" w:sz="0" w:space="0" w:color="auto"/>
+                <w:bottom w:val="none" w:sz="0" w:space="0" w:color="auto"/>
+                <w:right w:val="none" w:sz="0" w:space="0" w:color="auto"/>
+              </w:pBdr>
+              <w:tabs>
+                <w:tab w:val="center" w:pos="4324"/>
+              </w:tabs>
+              <w:spacing w:after="331" w:line="259" w:lineRule="auto"/>
+              <w:ind w:left="0" w:firstLine="0"/>
+            </w:pPr>
+          </w:p>
+        </w:tc>
+        <w:tc>
+          <w:tcPr>
+            <w:tcW w:w="2956" w:type="dxa"/>
+          </w:tcPr>
+          <w:p>
+            <w:pPr>
+              <w:pBdr>
+                <w:top w:val="none" w:sz="0" w:space="0" w:color="auto"/>
+                <w:left w:val="none" w:sz="0" w:space="0" w:color="auto"/>
+                <w:bottom w:val="none" w:sz="0" w:space="0" w:color="auto"/>
+                <w:right w:val="none" w:sz="0" w:space="0" w:color="auto"/>
+              </w:pBdr>
+              <w:tabs>
+                <w:tab w:val="center" w:pos="4324"/>
+              </w:tabs>
+              <w:spacing w:after="331" w:line="259" w:lineRule="auto"/>
+              <w:ind w:left="0" w:firstLine="0"/>
+            </w:pPr>
+          </w:p>
+        </w:tc>
+      </w:tr>
+      <w:tr>
+        <w:tc>
+          <w:tcPr>
+            <w:tcW w:w="1129" w:type="dxa"/>
+          </w:tcPr>
+          <w:p>
+            <w:pPr>
+              <w:pBdr>
+                <w:top w:val="none" w:sz="0" w:space="0" w:color="auto"/>
+                <w:left w:val="none" w:sz="0" w:space="0" w:color="auto"/>
+                <w:bottom w:val="none" w:sz="0" w:space="0" w:color="auto"/>
+                <w:right w:val="none" w:sz="0" w:space="0" w:color="auto"/>
+              </w:pBdr>
+              <w:tabs>
+                <w:tab w:val="center" w:pos="4324"/>
+              </w:tabs>
+              <w:spacing w:after="331" w:line="259" w:lineRule="auto"/>
+              <w:ind w:left="0" w:firstLine="0"/>
+            </w:pPr>
+          </w:p>
+        </w:tc>
+        <w:tc>
+          <w:tcPr>
+            <w:tcW w:w="2366" w:type="dxa"/>
+          </w:tcPr>
+          <w:p>
+            <w:pPr>
+              <w:pBdr>
+                <w:top w:val="none" w:sz="0" w:space="0" w:color="auto"/>
+                <w:left w:val="none" w:sz="0" w:space="0" w:color="auto"/>
+                <w:bottom w:val="none" w:sz="0" w:space="0" w:color="auto"/>
+                <w:right w:val="none" w:sz="0" w:space="0" w:color="auto"/>
+              </w:pBdr>
+              <w:tabs>
+                <w:tab w:val="center" w:pos="4324"/>
+              </w:tabs>
+              <w:spacing w:after="331" w:line="259" w:lineRule="auto"/>
+              <w:ind w:left="0" w:firstLine="0"/>
+            </w:pPr>
+          </w:p>
+        </w:tc>
+        <w:tc>
+          <w:tcPr>
+            <w:tcW w:w="2885" w:type="dxa"/>
+          </w:tcPr>
+          <w:p>
+            <w:pPr>
+              <w:pBdr>
+                <w:top w:val="none" w:sz="0" w:space="0" w:color="auto"/>
+                <w:left w:val="none" w:sz="0" w:space="0" w:color="auto"/>
+                <w:bottom w:val="none" w:sz="0" w:space="0" w:color="auto"/>
+                <w:right w:val="none" w:sz="0" w:space="0" w:color="auto"/>
+              </w:pBdr>
+              <w:tabs>
+                <w:tab w:val="center" w:pos="4324"/>
+              </w:tabs>
+              <w:spacing w:after="331" w:line="259" w:lineRule="auto"/>
+              <w:ind w:left="0" w:firstLine="0"/>
+            </w:pPr>
+          </w:p>
+        </w:tc>
+        <w:tc>
+          <w:tcPr>
+            <w:tcW w:w="2956" w:type="dxa"/>
           </w:tcPr>
           <w:p>
             <w:pPr>

</xml_diff>

<commit_message>
Reduced number of Q-Table states, adjusted Epsilon values, normalised choice function scores so it does not overwhelm q-values, helping prioritisation of q-values. Furthermore, updated log book
</commit_message>
<xml_diff>
--- a/docs/ECM3401 activity_log_form.docx
+++ b/docs/ECM3401 activity_log_form.docx
@@ -1965,11 +1965,9 @@
               <w:spacing w:after="331" w:line="259" w:lineRule="auto"/>
               <w:ind w:left="0" w:firstLine="0"/>
             </w:pPr>
-            <w:proofErr w:type="spellStart"/>
-            <w:r>
-              <w:t>Abandones</w:t>
-            </w:r>
-            <w:proofErr w:type="spellEnd"/>
+            <w:r>
+              <w:t>Abandoned</w:t>
+            </w:r>
             <w:r>
               <w:t xml:space="preserve"> the </w:t>
             </w:r>
@@ -2271,6 +2269,9 @@
             <w:r>
               <w:t xml:space="preserve">Made a start with report headers, </w:t>
             </w:r>
+            <w:r>
+              <w:t>however, still had more coursework to work on</w:t>
+            </w:r>
           </w:p>
         </w:tc>
         <w:tc>
@@ -2418,6 +2419,9 @@
               <w:spacing w:after="331" w:line="259" w:lineRule="auto"/>
               <w:ind w:left="0" w:firstLine="0"/>
             </w:pPr>
+            <w:r>
+              <w:t>11/3/2026</w:t>
+            </w:r>
           </w:p>
         </w:tc>
         <w:tc>
@@ -2500,6 +2504,10 @@
               <w:spacing w:after="331" w:line="259" w:lineRule="auto"/>
               <w:ind w:left="0" w:firstLine="0"/>
             </w:pPr>
+            <w:r>
+              <w:lastRenderedPageBreak/>
+              <w:t>15/3/2026</w:t>
+            </w:r>
           </w:p>
         </w:tc>
         <w:tc>
@@ -2520,6 +2528,9 @@
               <w:spacing w:after="331" w:line="259" w:lineRule="auto"/>
               <w:ind w:left="0" w:firstLine="0"/>
             </w:pPr>
+            <w:r>
+              <w:t>Q-Table never used for pretraining. Choice Function dominates prioritisation</w:t>
+            </w:r>
           </w:p>
         </w:tc>
         <w:tc>
@@ -2540,6 +2551,106 @@
               <w:spacing w:after="331" w:line="259" w:lineRule="auto"/>
               <w:ind w:left="0" w:firstLine="0"/>
             </w:pPr>
+            <w:r>
+              <w:t>The results from the fitness trace are still stochastically randomised</w:t>
+            </w:r>
+          </w:p>
+        </w:tc>
+        <w:tc>
+          <w:tcPr>
+            <w:tcW w:w="2956" w:type="dxa"/>
+          </w:tcPr>
+          <w:p>
+            <w:pPr>
+              <w:pBdr>
+                <w:top w:val="none" w:sz="0" w:space="0" w:color="auto"/>
+                <w:left w:val="none" w:sz="0" w:space="0" w:color="auto"/>
+                <w:bottom w:val="none" w:sz="0" w:space="0" w:color="auto"/>
+                <w:right w:val="none" w:sz="0" w:space="0" w:color="auto"/>
+              </w:pBdr>
+              <w:tabs>
+                <w:tab w:val="center" w:pos="4324"/>
+              </w:tabs>
+              <w:spacing w:after="331" w:line="259" w:lineRule="auto"/>
+              <w:ind w:left="0" w:firstLine="0"/>
+            </w:pPr>
+            <w:r>
+              <w:t>Normalised choice function value so q-values doesn’t get swamped</w:t>
+            </w:r>
+          </w:p>
+        </w:tc>
+      </w:tr>
+      <w:tr>
+        <w:tc>
+          <w:tcPr>
+            <w:tcW w:w="1129" w:type="dxa"/>
+          </w:tcPr>
+          <w:p>
+            <w:pPr>
+              <w:pBdr>
+                <w:top w:val="none" w:sz="0" w:space="0" w:color="auto"/>
+                <w:left w:val="none" w:sz="0" w:space="0" w:color="auto"/>
+                <w:bottom w:val="none" w:sz="0" w:space="0" w:color="auto"/>
+                <w:right w:val="none" w:sz="0" w:space="0" w:color="auto"/>
+              </w:pBdr>
+              <w:tabs>
+                <w:tab w:val="center" w:pos="4324"/>
+              </w:tabs>
+              <w:spacing w:after="331" w:line="259" w:lineRule="auto"/>
+              <w:ind w:left="0" w:firstLine="0"/>
+            </w:pPr>
+            <w:r>
+              <w:t>16/3/2026</w:t>
+            </w:r>
+          </w:p>
+        </w:tc>
+        <w:tc>
+          <w:tcPr>
+            <w:tcW w:w="2366" w:type="dxa"/>
+          </w:tcPr>
+          <w:p>
+            <w:pPr>
+              <w:pBdr>
+                <w:top w:val="none" w:sz="0" w:space="0" w:color="auto"/>
+                <w:left w:val="none" w:sz="0" w:space="0" w:color="auto"/>
+                <w:bottom w:val="none" w:sz="0" w:space="0" w:color="auto"/>
+                <w:right w:val="none" w:sz="0" w:space="0" w:color="auto"/>
+              </w:pBdr>
+              <w:tabs>
+                <w:tab w:val="center" w:pos="4324"/>
+              </w:tabs>
+              <w:spacing w:after="331" w:line="259" w:lineRule="auto"/>
+              <w:ind w:left="0" w:firstLine="0"/>
+            </w:pPr>
+            <w:r>
+              <w:t>Choice Function and Q-Value Table mix-up</w:t>
+            </w:r>
+            <w:r>
+              <w:t>.</w:t>
+            </w:r>
+          </w:p>
+        </w:tc>
+        <w:tc>
+          <w:tcPr>
+            <w:tcW w:w="2885" w:type="dxa"/>
+          </w:tcPr>
+          <w:p>
+            <w:pPr>
+              <w:pBdr>
+                <w:top w:val="none" w:sz="0" w:space="0" w:color="auto"/>
+                <w:left w:val="none" w:sz="0" w:space="0" w:color="auto"/>
+                <w:bottom w:val="none" w:sz="0" w:space="0" w:color="auto"/>
+                <w:right w:val="none" w:sz="0" w:space="0" w:color="auto"/>
+              </w:pBdr>
+              <w:tabs>
+                <w:tab w:val="center" w:pos="4324"/>
+              </w:tabs>
+              <w:spacing w:after="331" w:line="259" w:lineRule="auto"/>
+              <w:ind w:left="0" w:firstLine="0"/>
+            </w:pPr>
+            <w:r>
+              <w:t xml:space="preserve">No exploration from </w:t>
+            </w:r>
           </w:p>
         </w:tc>
         <w:tc>

</xml_diff>

<commit_message>
More Pretraining results, updated logbook
</commit_message>
<xml_diff>
--- a/docs/ECM3401 activity_log_form.docx
+++ b/docs/ECM3401 activity_log_form.docx
@@ -2693,6 +2693,9 @@
               <w:spacing w:after="331" w:line="259" w:lineRule="auto"/>
               <w:ind w:left="0" w:firstLine="0"/>
             </w:pPr>
+            <w:r>
+              <w:t>17/3/2026</w:t>
+            </w:r>
           </w:p>
         </w:tc>
         <w:tc>
@@ -2713,6 +2716,9 @@
               <w:spacing w:after="331" w:line="259" w:lineRule="auto"/>
               <w:ind w:left="0" w:firstLine="0"/>
             </w:pPr>
+            <w:r>
+              <w:t>Finished and submitted poster draft, and sent it to supervisor</w:t>
+            </w:r>
           </w:p>
         </w:tc>
         <w:tc>
@@ -2775,6 +2781,9 @@
               <w:spacing w:after="331" w:line="259" w:lineRule="auto"/>
               <w:ind w:left="0" w:firstLine="0"/>
             </w:pPr>
+            <w:r>
+              <w:t>19/3/2026</w:t>
+            </w:r>
           </w:p>
         </w:tc>
         <w:tc>
@@ -2795,6 +2804,9 @@
               <w:spacing w:after="331" w:line="259" w:lineRule="auto"/>
               <w:ind w:left="0" w:firstLine="0"/>
             </w:pPr>
+            <w:r>
+              <w:t xml:space="preserve">Show poster to supervisor, discussed pre-trained results with supervisor. </w:t>
+            </w:r>
           </w:p>
         </w:tc>
         <w:tc>

</xml_diff>

<commit_message>
Altered logbook, fixed mutated seeding issue, added automatic saving, tweaked the hyper-heuristic for efficient optimisation, and updated ReadMe. Half-way through coding the stretch-goal
</commit_message>
<xml_diff>
--- a/docs/ECM3401 activity_log_form.docx
+++ b/docs/ECM3401 activity_log_form.docx
@@ -1260,15 +1260,7 @@
               <w:ind w:left="0" w:firstLine="0"/>
             </w:pPr>
             <w:r>
-              <w:t xml:space="preserve">Build the hyper-heuristic for pre-training, integrate </w:t>
-            </w:r>
-            <w:proofErr w:type="spellStart"/>
-            <w:r>
-              <w:t>HyFlex</w:t>
-            </w:r>
-            <w:proofErr w:type="spellEnd"/>
-            <w:r>
-              <w:t>.</w:t>
+              <w:t>Begun planning for constructing the hyper-heuristic for the project.</w:t>
             </w:r>
           </w:p>
         </w:tc>
@@ -1795,6 +1787,22 @@
               <w:spacing w:after="331" w:line="259" w:lineRule="auto"/>
               <w:ind w:left="0" w:firstLine="0"/>
             </w:pPr>
+            <w:r>
+              <w:t xml:space="preserve">Test if the </w:t>
+            </w:r>
+            <w:proofErr w:type="spellStart"/>
+            <w:r>
+              <w:t>CustomHYS</w:t>
+            </w:r>
+            <w:proofErr w:type="spellEnd"/>
+            <w:r>
+              <w:t xml:space="preserve"> framework would run, if so, make a hyper-heuristic using </w:t>
+            </w:r>
+            <w:proofErr w:type="spellStart"/>
+            <w:r>
+              <w:t>CustomHYS</w:t>
+            </w:r>
+            <w:proofErr w:type="spellEnd"/>
           </w:p>
         </w:tc>
         <w:tc>
@@ -1880,6 +1888,9 @@
               <w:spacing w:after="331" w:line="259" w:lineRule="auto"/>
               <w:ind w:left="0" w:firstLine="0"/>
             </w:pPr>
+            <w:r>
+              <w:t xml:space="preserve">Test Hyflex on the </w:t>
+            </w:r>
           </w:p>
         </w:tc>
         <w:tc>
@@ -2267,7 +2278,13 @@
               <w:ind w:left="0" w:firstLine="0"/>
             </w:pPr>
             <w:r>
-              <w:t xml:space="preserve">Made a start with report headers, </w:t>
+              <w:t xml:space="preserve">Made a start </w:t>
+            </w:r>
+            <w:r>
+              <w:t xml:space="preserve">on the </w:t>
+            </w:r>
+            <w:r>
+              <w:t xml:space="preserve">report headers, </w:t>
             </w:r>
             <w:r>
               <w:t>however, still had more coursework to work on</w:t>
@@ -2420,6 +2437,7 @@
               <w:ind w:left="0" w:firstLine="0"/>
             </w:pPr>
             <w:r>
+              <w:lastRenderedPageBreak/>
               <w:t>11/3/2026</w:t>
             </w:r>
           </w:p>
@@ -2505,7 +2523,6 @@
               <w:ind w:left="0" w:firstLine="0"/>
             </w:pPr>
             <w:r>
-              <w:lastRenderedPageBreak/>
               <w:t>15/3/2026</w:t>
             </w:r>
           </w:p>
@@ -2869,6 +2886,9 @@
               <w:spacing w:after="331" w:line="259" w:lineRule="auto"/>
               <w:ind w:left="0" w:firstLine="0"/>
             </w:pPr>
+            <w:r>
+              <w:t>25/3/2026</w:t>
+            </w:r>
           </w:p>
         </w:tc>
         <w:tc>
@@ -2951,6 +2971,9 @@
               <w:spacing w:after="331" w:line="259" w:lineRule="auto"/>
               <w:ind w:left="0" w:firstLine="0"/>
             </w:pPr>
+            <w:r>
+              <w:t>7/4/2026</w:t>
+            </w:r>
           </w:p>
         </w:tc>
         <w:tc>

</xml_diff>

<commit_message>
Finished logbook, added adjustable fontsizes to visualisation plots, adjusted/removed comments
</commit_message>
<xml_diff>
--- a/docs/ECM3401 activity_log_form.docx
+++ b/docs/ECM3401 activity_log_form.docx
@@ -528,6 +528,7 @@
                 <w:tab w:val="center" w:pos="4324"/>
               </w:tabs>
               <w:spacing w:after="331" w:line="259" w:lineRule="auto"/>
+              <w:ind w:left="0" w:firstLine="0"/>
             </w:pPr>
             <w:r>
               <w:t>Research into hyper-heuristics</w:t>
@@ -545,6 +546,7 @@
                 <w:tab w:val="center" w:pos="4324"/>
               </w:tabs>
               <w:spacing w:after="331" w:line="259" w:lineRule="auto"/>
+              <w:ind w:left="0" w:firstLine="0"/>
             </w:pPr>
             <w:r>
               <w:t>Gather more papers for literature review</w:t>
@@ -682,7 +684,13 @@
               <w:ind w:left="0" w:firstLine="0"/>
             </w:pPr>
             <w:r>
-              <w:t>Did a bit more research into the topics that I could incorporate the Literature Review</w:t>
+              <w:t xml:space="preserve">Did more research into the topics that I could incorporate </w:t>
+            </w:r>
+            <w:r>
+              <w:t xml:space="preserve">in </w:t>
+            </w:r>
+            <w:r>
+              <w:t>the Literature Review</w:t>
             </w:r>
           </w:p>
         </w:tc>
@@ -705,7 +713,31 @@
               <w:ind w:left="0" w:firstLine="0"/>
             </w:pPr>
             <w:r>
-              <w:t>Haven’t started on the project due to overwhelming project plan</w:t>
+              <w:t>Have</w:t>
+            </w:r>
+            <w:r>
+              <w:t xml:space="preserve"> </w:t>
+            </w:r>
+            <w:r>
+              <w:t>n</w:t>
+            </w:r>
+            <w:r>
+              <w:t>o</w:t>
+            </w:r>
+            <w:r>
+              <w:t xml:space="preserve">t </w:t>
+            </w:r>
+            <w:r>
+              <w:t xml:space="preserve">yet </w:t>
+            </w:r>
+            <w:r>
+              <w:t xml:space="preserve">started on the project due to </w:t>
+            </w:r>
+            <w:r>
+              <w:t>focus on</w:t>
+            </w:r>
+            <w:r>
+              <w:t xml:space="preserve"> project plan</w:t>
             </w:r>
           </w:p>
         </w:tc>
@@ -865,7 +897,25 @@
               <w:ind w:left="0" w:firstLine="0"/>
             </w:pPr>
             <w:r>
-              <w:t>Made a small amount of progress with nature-inspired coursework.</w:t>
+              <w:t>Ma</w:t>
+            </w:r>
+            <w:r>
+              <w:t>ke</w:t>
+            </w:r>
+            <w:r>
+              <w:t xml:space="preserve"> progress with </w:t>
+            </w:r>
+            <w:r>
+              <w:t>N</w:t>
+            </w:r>
+            <w:r>
+              <w:t>ature-</w:t>
+            </w:r>
+            <w:r>
+              <w:t>I</w:t>
+            </w:r>
+            <w:r>
+              <w:t>nspired coursework.</w:t>
             </w:r>
           </w:p>
           <w:p>
@@ -906,10 +956,10 @@
               <w:ind w:left="0" w:firstLine="0"/>
             </w:pPr>
             <w:r>
-              <w:t>Finished a final draft of the literature review ready for the supervisor to review it</w:t>
-            </w:r>
-            <w:r>
-              <w:br/>
+              <w:t>Finished a final draft of the literature review ready for the supervisor to review</w:t>
+            </w:r>
+            <w:r>
+              <w:t>.</w:t>
             </w:r>
           </w:p>
         </w:tc>
@@ -932,7 +982,13 @@
               <w:ind w:left="0" w:firstLine="0"/>
             </w:pPr>
             <w:r>
-              <w:t>I need to tweak the grammar and the writing of the literature review so that it flows nicely. I also need to review project plan with my supervisor.</w:t>
+              <w:t xml:space="preserve">I need to tweak the grammar and the </w:t>
+            </w:r>
+            <w:r>
+              <w:t>text</w:t>
+            </w:r>
+            <w:r>
+              <w:t xml:space="preserve"> of the literature review so that it flows nicely. I also need to review project plan with my supervisor.</w:t>
             </w:r>
           </w:p>
         </w:tc>
@@ -980,7 +1036,10 @@
               <w:ind w:left="0" w:firstLine="0"/>
             </w:pPr>
             <w:r>
-              <w:t>Tweak the grammar and punctuation and thoroughly</w:t>
+              <w:t>Tweak the grammar and punctuation thoroughly</w:t>
+            </w:r>
+            <w:r>
+              <w:t>,</w:t>
             </w:r>
             <w:r>
               <w:t xml:space="preserve"> and discuss project plan with my supervisor</w:t>
@@ -1006,7 +1065,13 @@
               <w:ind w:left="0" w:firstLine="0"/>
             </w:pPr>
             <w:r>
-              <w:t>Shrunk the project plan so that it is simpler and bearable within the given time frame</w:t>
+              <w:t xml:space="preserve">Shrunk the project plan so that it is simpler and </w:t>
+            </w:r>
+            <w:r>
+              <w:t>achievable</w:t>
+            </w:r>
+            <w:r>
+              <w:t xml:space="preserve"> within the given time frame</w:t>
             </w:r>
           </w:p>
         </w:tc>
@@ -1029,7 +1094,21 @@
               <w:ind w:left="0" w:firstLine="0"/>
             </w:pPr>
             <w:r>
-              <w:t xml:space="preserve">I will need to postpone any updates on my literature review to focus on my </w:t>
+              <w:t xml:space="preserve">I will need to </w:t>
+            </w:r>
+            <w:bookmarkStart w:id="0" w:name="_Hlk228112531"/>
+            <w:r>
+              <w:t xml:space="preserve">postpone any updates </w:t>
+            </w:r>
+            <w:r>
+              <w:t>to</w:t>
+            </w:r>
+            <w:r>
+              <w:t xml:space="preserve"> my literature review to focus on </w:t>
+            </w:r>
+            <w:bookmarkEnd w:id="0"/>
+            <w:r>
+              <w:t>completing the Nature-Inspired coursework</w:t>
             </w:r>
           </w:p>
         </w:tc>
@@ -1077,11 +1156,22 @@
               <w:ind w:left="0" w:firstLine="0"/>
             </w:pPr>
             <w:r>
-              <w:t xml:space="preserve">No additional progress on the literature review due </w:t>
-            </w:r>
-            <w:r>
-              <w:lastRenderedPageBreak/>
-              <w:t>to deadline for nature-inspired coursework</w:t>
+              <w:t xml:space="preserve">Submit </w:t>
+            </w:r>
+            <w:r>
+              <w:t>N</w:t>
+            </w:r>
+            <w:r>
+              <w:t>ature-</w:t>
+            </w:r>
+            <w:r>
+              <w:t>I</w:t>
+            </w:r>
+            <w:r>
+              <w:t>nspired coursework</w:t>
+            </w:r>
+            <w:r>
+              <w:t xml:space="preserve"> then update the literature review.</w:t>
             </w:r>
           </w:p>
         </w:tc>
@@ -1103,6 +1193,15 @@
               <w:spacing w:after="331" w:line="259" w:lineRule="auto"/>
               <w:ind w:left="0" w:firstLine="0"/>
             </w:pPr>
+            <w:r>
+              <w:t xml:space="preserve">Coursework submitted on time, </w:t>
+            </w:r>
+            <w:r>
+              <w:t xml:space="preserve">then </w:t>
+            </w:r>
+            <w:r>
+              <w:t>focussed on literature review</w:t>
+            </w:r>
           </w:p>
         </w:tc>
         <w:tc>
@@ -1123,6 +1222,9 @@
               <w:spacing w:after="331" w:line="259" w:lineRule="auto"/>
               <w:ind w:left="0" w:firstLine="0"/>
             </w:pPr>
+            <w:r>
+              <w:t>No comment needed</w:t>
+            </w:r>
           </w:p>
         </w:tc>
       </w:tr>
@@ -1146,6 +1248,7 @@
               <w:ind w:left="0" w:firstLine="0"/>
             </w:pPr>
             <w:r>
+              <w:lastRenderedPageBreak/>
               <w:t>17/11/2025</w:t>
             </w:r>
           </w:p>
@@ -1169,10 +1272,7 @@
               <w:ind w:left="0" w:firstLine="0"/>
             </w:pPr>
             <w:r>
-              <w:t>Submitted literature review, started on coding</w:t>
-            </w:r>
-            <w:r>
-              <w:t xml:space="preserve"> for the project</w:t>
+              <w:t>Finish and submit the literature review</w:t>
             </w:r>
           </w:p>
         </w:tc>
@@ -1194,6 +1294,18 @@
               <w:spacing w:after="331" w:line="259" w:lineRule="auto"/>
               <w:ind w:left="0" w:firstLine="0"/>
             </w:pPr>
+            <w:r>
+              <w:t xml:space="preserve">Completed </w:t>
+            </w:r>
+            <w:r>
+              <w:t>a</w:t>
+            </w:r>
+            <w:r>
+              <w:t xml:space="preserve"> few adjustments for the literature review and constructively assessed the quality</w:t>
+            </w:r>
+            <w:r>
+              <w:t xml:space="preserve"> of my project ideas</w:t>
+            </w:r>
           </w:p>
         </w:tc>
         <w:tc>
@@ -1214,6 +1326,9 @@
               <w:spacing w:after="331" w:line="259" w:lineRule="auto"/>
               <w:ind w:left="0" w:firstLine="0"/>
             </w:pPr>
+            <w:r>
+              <w:t>No comment needed</w:t>
+            </w:r>
           </w:p>
         </w:tc>
       </w:tr>
@@ -1260,7 +1375,10 @@
               <w:ind w:left="0" w:firstLine="0"/>
             </w:pPr>
             <w:r>
-              <w:t>Begun planning for constructing the hyper-heuristic for the project.</w:t>
+              <w:t>Plan</w:t>
+            </w:r>
+            <w:r>
+              <w:t xml:space="preserve"> for constructing the hyper-heuristic for the project.</w:t>
             </w:r>
           </w:p>
         </w:tc>
@@ -1282,6 +1400,9 @@
               <w:spacing w:after="331" w:line="259" w:lineRule="auto"/>
               <w:ind w:left="0" w:firstLine="0"/>
             </w:pPr>
+            <w:r>
+              <w:t>Searched for other examples of hyper-heuristic made to get an idea on how to make a Choice Function hyper-heuristic</w:t>
+            </w:r>
           </w:p>
         </w:tc>
         <w:tc>
@@ -1302,6 +1423,9 @@
               <w:spacing w:after="331" w:line="259" w:lineRule="auto"/>
               <w:ind w:left="0" w:firstLine="0"/>
             </w:pPr>
+            <w:r>
+              <w:t>Since I was new to this, I wanted to grasp an idea of how certain hyper-heuristics are made</w:t>
+            </w:r>
           </w:p>
         </w:tc>
       </w:tr>
@@ -1350,6 +1474,29 @@
               <w:spacing w:after="331" w:line="259" w:lineRule="auto"/>
               <w:ind w:left="0" w:firstLine="0"/>
             </w:pPr>
+            <w:r>
+              <w:t xml:space="preserve">Import the </w:t>
+            </w:r>
+            <w:proofErr w:type="spellStart"/>
+            <w:r>
+              <w:t>CustomHYS</w:t>
+            </w:r>
+            <w:proofErr w:type="spellEnd"/>
+            <w:r>
+              <w:t xml:space="preserve"> </w:t>
+            </w:r>
+            <w:r>
+              <w:t>framework</w:t>
+            </w:r>
+            <w:r>
+              <w:t xml:space="preserve"> and beg</w:t>
+            </w:r>
+            <w:r>
+              <w:t>i</w:t>
+            </w:r>
+            <w:r>
+              <w:t>n adjusting</w:t>
+            </w:r>
           </w:p>
         </w:tc>
         <w:tc>
@@ -1370,6 +1517,20 @@
               <w:spacing w:after="331" w:line="259" w:lineRule="auto"/>
               <w:ind w:left="0" w:firstLine="0"/>
             </w:pPr>
+            <w:r>
+              <w:t xml:space="preserve">Made </w:t>
+            </w:r>
+            <w:r>
+              <w:t xml:space="preserve">small adjustments to the </w:t>
+            </w:r>
+            <w:proofErr w:type="spellStart"/>
+            <w:r>
+              <w:t>CustomHYS</w:t>
+            </w:r>
+            <w:proofErr w:type="spellEnd"/>
+            <w:r>
+              <w:t xml:space="preserve"> framework</w:t>
+            </w:r>
           </w:p>
         </w:tc>
         <w:tc>
@@ -1390,6 +1551,9 @@
               <w:spacing w:after="331" w:line="259" w:lineRule="auto"/>
               <w:ind w:left="0" w:firstLine="0"/>
             </w:pPr>
+            <w:r>
+              <w:t>No comment needed</w:t>
+            </w:r>
           </w:p>
         </w:tc>
       </w:tr>
@@ -1413,13 +1577,7 @@
               <w:ind w:left="0" w:firstLine="0"/>
             </w:pPr>
             <w:r>
-              <w:t>10/1</w:t>
-            </w:r>
-            <w:r>
-              <w:t>2</w:t>
-            </w:r>
-            <w:r>
-              <w:t>/2025</w:t>
+              <w:t>Break</w:t>
             </w:r>
           </w:p>
         </w:tc>
@@ -1441,6 +1599,9 @@
               <w:spacing w:after="331" w:line="259" w:lineRule="auto"/>
               <w:ind w:left="0" w:firstLine="0"/>
             </w:pPr>
+            <w:r>
+              <w:t>Christmas Break</w:t>
+            </w:r>
           </w:p>
         </w:tc>
         <w:tc>
@@ -1504,7 +1665,7 @@
               <w:ind w:left="0" w:firstLine="0"/>
             </w:pPr>
             <w:r>
-              <w:t>Break</w:t>
+              <w:t>13/1/2026</w:t>
             </w:r>
           </w:p>
         </w:tc>
@@ -1527,7 +1688,10 @@
               <w:ind w:left="0" w:firstLine="0"/>
             </w:pPr>
             <w:r>
-              <w:t>Christmas Break</w:t>
+              <w:t>After</w:t>
+            </w:r>
+            <w:r>
+              <w:t xml:space="preserve"> Christmas holidays, research more papers</w:t>
             </w:r>
           </w:p>
         </w:tc>
@@ -1549,6 +1713,9 @@
               <w:spacing w:after="331" w:line="259" w:lineRule="auto"/>
               <w:ind w:left="0" w:firstLine="0"/>
             </w:pPr>
+            <w:r>
+              <w:t>Found no papers on “pre-training hyper-heuristics” or something similar</w:t>
+            </w:r>
           </w:p>
         </w:tc>
         <w:tc>
@@ -1569,6 +1736,9 @@
               <w:spacing w:after="331" w:line="259" w:lineRule="auto"/>
               <w:ind w:left="0" w:firstLine="0"/>
             </w:pPr>
+            <w:r>
+              <w:t>No comment needed</w:t>
+            </w:r>
           </w:p>
         </w:tc>
       </w:tr>
@@ -1592,7 +1762,7 @@
               <w:ind w:left="0" w:firstLine="0"/>
             </w:pPr>
             <w:r>
-              <w:t>9/1/2026</w:t>
+              <w:t>20/1/2026</w:t>
             </w:r>
           </w:p>
         </w:tc>
@@ -1615,8 +1785,33 @@
               <w:ind w:left="0" w:firstLine="0"/>
             </w:pPr>
             <w:r>
-              <w:t xml:space="preserve">Came back from Christmas holiday, </w:t>
-            </w:r>
+              <w:t xml:space="preserve">Test if the </w:t>
+            </w:r>
+            <w:proofErr w:type="spellStart"/>
+            <w:r>
+              <w:t>CustomHYS</w:t>
+            </w:r>
+            <w:proofErr w:type="spellEnd"/>
+            <w:r>
+              <w:t xml:space="preserve"> framework </w:t>
+            </w:r>
+            <w:r>
+              <w:t>can</w:t>
+            </w:r>
+            <w:r>
+              <w:t xml:space="preserve"> run</w:t>
+            </w:r>
+            <w:r>
+              <w:t>. I</w:t>
+            </w:r>
+            <w:r>
+              <w:t xml:space="preserve">f so, make a hyper-heuristic using </w:t>
+            </w:r>
+            <w:proofErr w:type="spellStart"/>
+            <w:r>
+              <w:t>CustomHYS</w:t>
+            </w:r>
+            <w:proofErr w:type="spellEnd"/>
           </w:p>
         </w:tc>
         <w:tc>
@@ -1637,6 +1832,17 @@
               <w:spacing w:after="331" w:line="259" w:lineRule="auto"/>
               <w:ind w:left="0" w:firstLine="0"/>
             </w:pPr>
+            <w:r>
+              <w:t xml:space="preserve">After researching </w:t>
+            </w:r>
+            <w:proofErr w:type="spellStart"/>
+            <w:r>
+              <w:t>CustomHYS</w:t>
+            </w:r>
+            <w:proofErr w:type="spellEnd"/>
+            <w:r>
+              <w:t xml:space="preserve"> extensively, it was a struggle to get it running as the repository was in W.I.P status and there were too many issues and bugs in getting the code to run</w:t>
+            </w:r>
           </w:p>
         </w:tc>
         <w:tc>
@@ -1657,6 +1863,41 @@
               <w:spacing w:after="331" w:line="259" w:lineRule="auto"/>
               <w:ind w:left="0" w:firstLine="0"/>
             </w:pPr>
+            <w:r>
+              <w:t xml:space="preserve">It was difficult to try and combine both </w:t>
+            </w:r>
+            <w:proofErr w:type="spellStart"/>
+            <w:r>
+              <w:t>HyFlex</w:t>
+            </w:r>
+            <w:proofErr w:type="spellEnd"/>
+            <w:r>
+              <w:t xml:space="preserve"> and </w:t>
+            </w:r>
+            <w:proofErr w:type="spellStart"/>
+            <w:r>
+              <w:t>CustomHYS</w:t>
+            </w:r>
+            <w:proofErr w:type="spellEnd"/>
+            <w:r>
+              <w:t xml:space="preserve"> repositories, given that the nature of </w:t>
+            </w:r>
+            <w:proofErr w:type="spellStart"/>
+            <w:r>
+              <w:t>HyFlex</w:t>
+            </w:r>
+            <w:proofErr w:type="spellEnd"/>
+            <w:r>
+              <w:t xml:space="preserve"> is designed for the problems to be hidden with the heuristics stored in the problem domains, while </w:t>
+            </w:r>
+            <w:proofErr w:type="spellStart"/>
+            <w:r>
+              <w:t>CustomHYS</w:t>
+            </w:r>
+            <w:proofErr w:type="spellEnd"/>
+            <w:r>
+              <w:t xml:space="preserve"> contains the heuristics to be selected or generated</w:t>
+            </w:r>
           </w:p>
         </w:tc>
       </w:tr>
@@ -1680,7 +1921,7 @@
               <w:ind w:left="0" w:firstLine="0"/>
             </w:pPr>
             <w:r>
-              <w:t>13/1/2026</w:t>
+              <w:t>26/1/2026</w:t>
             </w:r>
           </w:p>
         </w:tc>
@@ -1702,6 +1943,32 @@
               <w:spacing w:after="331" w:line="259" w:lineRule="auto"/>
               <w:ind w:left="0" w:firstLine="0"/>
             </w:pPr>
+            <w:r>
+              <w:t>Test</w:t>
+            </w:r>
+            <w:r>
+              <w:t xml:space="preserve"> the </w:t>
+            </w:r>
+            <w:proofErr w:type="spellStart"/>
+            <w:r>
+              <w:t>Hy</w:t>
+            </w:r>
+            <w:r>
+              <w:t>F</w:t>
+            </w:r>
+            <w:r>
+              <w:t>lex</w:t>
+            </w:r>
+            <w:proofErr w:type="spellEnd"/>
+            <w:r>
+              <w:t xml:space="preserve"> build to see if it w</w:t>
+            </w:r>
+            <w:r>
+              <w:t>ill</w:t>
+            </w:r>
+            <w:r>
+              <w:t xml:space="preserve"> also work</w:t>
+            </w:r>
           </w:p>
         </w:tc>
         <w:tc>
@@ -1722,6 +1989,17 @@
               <w:spacing w:after="331" w:line="259" w:lineRule="auto"/>
               <w:ind w:left="0" w:firstLine="0"/>
             </w:pPr>
+            <w:r>
+              <w:t xml:space="preserve">The </w:t>
+            </w:r>
+            <w:proofErr w:type="spellStart"/>
+            <w:r>
+              <w:t>HyFlex</w:t>
+            </w:r>
+            <w:proofErr w:type="spellEnd"/>
+            <w:r>
+              <w:t xml:space="preserve"> was successfully built and running after tweaking the backend</w:t>
+            </w:r>
           </w:p>
         </w:tc>
         <w:tc>
@@ -1742,6 +2020,9 @@
               <w:spacing w:after="331" w:line="259" w:lineRule="auto"/>
               <w:ind w:left="0" w:firstLine="0"/>
             </w:pPr>
+            <w:r>
+              <w:t>The deeply embedded code in the backend has an illegal Unicode character, that stopped Gradle from building it</w:t>
+            </w:r>
           </w:p>
         </w:tc>
       </w:tr>
@@ -1765,7 +2046,7 @@
               <w:ind w:left="0" w:firstLine="0"/>
             </w:pPr>
             <w:r>
-              <w:t>20/1/2026</w:t>
+              <w:t>2/2/2026</w:t>
             </w:r>
           </w:p>
         </w:tc>
@@ -1788,7 +2069,10 @@
               <w:ind w:left="0" w:firstLine="0"/>
             </w:pPr>
             <w:r>
-              <w:t xml:space="preserve">Test if the </w:t>
+              <w:t>Consider whether to continue with or abandon</w:t>
+            </w:r>
+            <w:r>
+              <w:t xml:space="preserve"> the </w:t>
             </w:r>
             <w:proofErr w:type="spellStart"/>
             <w:r>
@@ -1796,33 +2080,71 @@
             </w:r>
             <w:proofErr w:type="spellEnd"/>
             <w:r>
-              <w:t xml:space="preserve"> framework would run, if so, make a hyper-heuristic using </w:t>
+              <w:t xml:space="preserve"> framework. </w:t>
+            </w:r>
+          </w:p>
+        </w:tc>
+        <w:tc>
+          <w:tcPr>
+            <w:tcW w:w="2885" w:type="dxa"/>
+          </w:tcPr>
+          <w:p>
+            <w:pPr>
+              <w:pBdr>
+                <w:top w:val="none" w:sz="0" w:space="0" w:color="auto"/>
+                <w:left w:val="none" w:sz="0" w:space="0" w:color="auto"/>
+                <w:bottom w:val="none" w:sz="0" w:space="0" w:color="auto"/>
+                <w:right w:val="none" w:sz="0" w:space="0" w:color="auto"/>
+              </w:pBdr>
+              <w:tabs>
+                <w:tab w:val="center" w:pos="4324"/>
+              </w:tabs>
+              <w:spacing w:after="331" w:line="259" w:lineRule="auto"/>
+              <w:ind w:left="0" w:firstLine="0"/>
+            </w:pPr>
+            <w:r>
+              <w:t xml:space="preserve">Use of the </w:t>
             </w:r>
             <w:proofErr w:type="spellStart"/>
             <w:r>
               <w:t>CustomHYS</w:t>
             </w:r>
             <w:proofErr w:type="spellEnd"/>
-          </w:p>
-        </w:tc>
-        <w:tc>
-          <w:tcPr>
-            <w:tcW w:w="2885" w:type="dxa"/>
-          </w:tcPr>
-          <w:p>
-            <w:pPr>
-              <w:pBdr>
-                <w:top w:val="none" w:sz="0" w:space="0" w:color="auto"/>
-                <w:left w:val="none" w:sz="0" w:space="0" w:color="auto"/>
-                <w:bottom w:val="none" w:sz="0" w:space="0" w:color="auto"/>
-                <w:right w:val="none" w:sz="0" w:space="0" w:color="auto"/>
-              </w:pBdr>
-              <w:tabs>
-                <w:tab w:val="center" w:pos="4324"/>
-              </w:tabs>
-              <w:spacing w:after="331" w:line="259" w:lineRule="auto"/>
-              <w:ind w:left="0" w:firstLine="0"/>
-            </w:pPr>
+            <w:r>
+              <w:t xml:space="preserve"> framework was abandoned after too many optimisation problems.</w:t>
+            </w:r>
+          </w:p>
+          <w:p>
+            <w:pPr>
+              <w:pBdr>
+                <w:top w:val="none" w:sz="0" w:space="0" w:color="auto"/>
+                <w:left w:val="none" w:sz="0" w:space="0" w:color="auto"/>
+                <w:bottom w:val="none" w:sz="0" w:space="0" w:color="auto"/>
+                <w:right w:val="none" w:sz="0" w:space="0" w:color="auto"/>
+              </w:pBdr>
+              <w:tabs>
+                <w:tab w:val="center" w:pos="4324"/>
+              </w:tabs>
+              <w:spacing w:after="331" w:line="259" w:lineRule="auto"/>
+              <w:ind w:left="0" w:firstLine="0"/>
+            </w:pPr>
+            <w:r>
+              <w:t>I had to rewrite my entire code fro</w:t>
+            </w:r>
+            <w:r>
+              <w:t>m scratch</w:t>
+            </w:r>
+            <w:r>
+              <w:t xml:space="preserve"> and build a </w:t>
+            </w:r>
+            <w:proofErr w:type="spellStart"/>
+            <w:r>
+              <w:t>HyFlex</w:t>
+            </w:r>
+            <w:proofErr w:type="spellEnd"/>
+            <w:r>
+              <w:t>-style hyper-heuristic</w:t>
+            </w:r>
           </w:p>
         </w:tc>
         <w:tc>
@@ -1843,6 +2165,15 @@
               <w:spacing w:after="331" w:line="259" w:lineRule="auto"/>
               <w:ind w:left="0" w:firstLine="0"/>
             </w:pPr>
+            <w:r>
+              <w:t>Dedicate the whole week to coding my project to see if I could get a working base model of a hyper</w:t>
+            </w:r>
+            <w:r>
+              <w:t>-</w:t>
+            </w:r>
+            <w:r>
+              <w:t>heuristic</w:t>
+            </w:r>
           </w:p>
         </w:tc>
       </w:tr>
@@ -1866,7 +2197,7 @@
               <w:ind w:left="0" w:firstLine="0"/>
             </w:pPr>
             <w:r>
-              <w:t>26/1/2026</w:t>
+              <w:t>12/2/2026</w:t>
             </w:r>
           </w:p>
         </w:tc>
@@ -1889,7 +2220,36 @@
               <w:ind w:left="0" w:firstLine="0"/>
             </w:pPr>
             <w:r>
-              <w:t xml:space="preserve">Test Hyflex on the </w:t>
+              <w:t>Make</w:t>
+            </w:r>
+            <w:r>
+              <w:t xml:space="preserve"> a </w:t>
+            </w:r>
+            <w:r>
+              <w:t xml:space="preserve">Choice Function </w:t>
+            </w:r>
+            <w:r>
+              <w:t>hyper-heuristic</w:t>
+            </w:r>
+            <w:r>
+              <w:t xml:space="preserve"> </w:t>
+            </w:r>
+            <w:r>
+              <w:t xml:space="preserve">that operates on </w:t>
+            </w:r>
+            <w:proofErr w:type="spellStart"/>
+            <w:r>
+              <w:t>Hy</w:t>
+            </w:r>
+            <w:r>
+              <w:t>F</w:t>
+            </w:r>
+            <w:r>
+              <w:t>lex</w:t>
+            </w:r>
+            <w:proofErr w:type="spellEnd"/>
+            <w:r>
+              <w:t xml:space="preserve"> optimisation problems</w:t>
             </w:r>
           </w:p>
         </w:tc>
@@ -1911,6 +2271,21 @@
               <w:spacing w:after="331" w:line="259" w:lineRule="auto"/>
               <w:ind w:left="0" w:firstLine="0"/>
             </w:pPr>
+            <w:r>
+              <w:t>Successfully made a Choice Function hyper-heuristic that enabled c</w:t>
+            </w:r>
+            <w:r>
+              <w:t>omplet</w:t>
+            </w:r>
+            <w:r>
+              <w:t>ion of</w:t>
+            </w:r>
+            <w:r>
+              <w:t xml:space="preserve"> the first milestone of the project</w:t>
+            </w:r>
+            <w:r>
+              <w:t>.</w:t>
+            </w:r>
           </w:p>
         </w:tc>
         <w:tc>
@@ -1931,6 +2306,9 @@
               <w:spacing w:after="331" w:line="259" w:lineRule="auto"/>
               <w:ind w:left="0" w:firstLine="0"/>
             </w:pPr>
+            <w:r>
+              <w:t>Asked David (supervisor) for 2 weeks off to focus on coursework deadlines for other modules</w:t>
+            </w:r>
           </w:p>
         </w:tc>
       </w:tr>
@@ -1954,7 +2332,7 @@
               <w:ind w:left="0" w:firstLine="0"/>
             </w:pPr>
             <w:r>
-              <w:t>2/2/2026</w:t>
+              <w:t>16/2/2026</w:t>
             </w:r>
           </w:p>
         </w:tc>
@@ -1977,18 +2355,10 @@
               <w:ind w:left="0" w:firstLine="0"/>
             </w:pPr>
             <w:r>
-              <w:t>Abandoned</w:t>
-            </w:r>
-            <w:r>
-              <w:t xml:space="preserve"> the </w:t>
-            </w:r>
-            <w:proofErr w:type="spellStart"/>
-            <w:r>
-              <w:t>CustomHYS</w:t>
-            </w:r>
-            <w:proofErr w:type="spellEnd"/>
-            <w:r>
-              <w:t xml:space="preserve"> framework after too many optimisation problems. </w:t>
+              <w:t>F</w:t>
+            </w:r>
+            <w:r>
+              <w:t>ocus on coursework</w:t>
             </w:r>
           </w:p>
         </w:tc>
@@ -2011,7 +2381,22 @@
               <w:ind w:left="0" w:firstLine="0"/>
             </w:pPr>
             <w:r>
-              <w:t xml:space="preserve">I had to rewrite my entire code from scratch. </w:t>
+              <w:t>Submitted</w:t>
+            </w:r>
+            <w:r>
+              <w:t xml:space="preserve"> my coursework </w:t>
+            </w:r>
+            <w:r>
+              <w:t>o</w:t>
+            </w:r>
+            <w:r>
+              <w:t xml:space="preserve">n time; </w:t>
+            </w:r>
+            <w:r>
+              <w:t>however,</w:t>
+            </w:r>
+            <w:r>
+              <w:t xml:space="preserve"> I had to do 2 more for the next upcoming weeks</w:t>
             </w:r>
           </w:p>
         </w:tc>
@@ -2034,13 +2419,8 @@
               <w:ind w:left="0" w:firstLine="0"/>
             </w:pPr>
             <w:r>
-              <w:t xml:space="preserve">Dedicate the whole week to coding my project to see if I could get a working base model of a </w:t>
-            </w:r>
-            <w:proofErr w:type="spellStart"/>
-            <w:r>
-              <w:t>hyperheuristic</w:t>
-            </w:r>
-            <w:proofErr w:type="spellEnd"/>
+              <w:t>No major comment needed</w:t>
+            </w:r>
           </w:p>
         </w:tc>
       </w:tr>
@@ -2064,7 +2444,8 @@
               <w:ind w:left="0" w:firstLine="0"/>
             </w:pPr>
             <w:r>
-              <w:t>12/2/2026</w:t>
+              <w:lastRenderedPageBreak/>
+              <w:t>25/2/2026</w:t>
             </w:r>
           </w:p>
         </w:tc>
@@ -2087,7 +2468,22 @@
               <w:ind w:left="0" w:firstLine="0"/>
             </w:pPr>
             <w:r>
-              <w:t>Successfully made a hyper-heuristic with that operates on Hyflex optimisation problems</w:t>
+              <w:t>Ma</w:t>
+            </w:r>
+            <w:r>
+              <w:t>k</w:t>
+            </w:r>
+            <w:r>
+              <w:t xml:space="preserve">e a start </w:t>
+            </w:r>
+            <w:r>
+              <w:t xml:space="preserve">on the </w:t>
+            </w:r>
+            <w:r>
+              <w:t>report headers</w:t>
+            </w:r>
+            <w:r>
+              <w:t>.</w:t>
             </w:r>
           </w:p>
         </w:tc>
@@ -2109,6 +2505,12 @@
               <w:spacing w:after="331" w:line="259" w:lineRule="auto"/>
               <w:ind w:left="0" w:firstLine="0"/>
             </w:pPr>
+            <w:r>
+              <w:t>Made a little progress on the project</w:t>
+            </w:r>
+            <w:r>
+              <w:t xml:space="preserve"> but still had more coursework to work on</w:t>
+            </w:r>
           </w:p>
         </w:tc>
         <w:tc>
@@ -2130,7 +2532,7 @@
               <w:ind w:left="0" w:firstLine="0"/>
             </w:pPr>
             <w:r>
-              <w:t>Asked David (supervisor) for 2 weeks off to focus on coursework deadlines for other modules</w:t>
+              <w:t>No comment needed</w:t>
             </w:r>
           </w:p>
         </w:tc>
@@ -2155,7 +2557,7 @@
               <w:ind w:left="0" w:firstLine="0"/>
             </w:pPr>
             <w:r>
-              <w:t>16/2/2026</w:t>
+              <w:t>4/3/2026</w:t>
             </w:r>
           </w:p>
         </w:tc>
@@ -2178,7 +2580,52 @@
               <w:ind w:left="0" w:firstLine="0"/>
             </w:pPr>
             <w:r>
-              <w:t>Made no progress with project, focussed on coursework</w:t>
+              <w:t>Sen</w:t>
+            </w:r>
+            <w:r>
+              <w:t>d</w:t>
+            </w:r>
+            <w:r>
+              <w:t xml:space="preserve"> </w:t>
+            </w:r>
+            <w:r>
+              <w:t xml:space="preserve">a </w:t>
+            </w:r>
+            <w:r>
+              <w:t xml:space="preserve">draft of section titles and table of contents to </w:t>
+            </w:r>
+            <w:r>
+              <w:t>supervisor</w:t>
+            </w:r>
+          </w:p>
+          <w:p>
+            <w:pPr>
+              <w:pBdr>
+                <w:top w:val="none" w:sz="0" w:space="0" w:color="auto"/>
+                <w:left w:val="none" w:sz="0" w:space="0" w:color="auto"/>
+                <w:bottom w:val="none" w:sz="0" w:space="0" w:color="auto"/>
+                <w:right w:val="none" w:sz="0" w:space="0" w:color="auto"/>
+              </w:pBdr>
+              <w:tabs>
+                <w:tab w:val="center" w:pos="4324"/>
+              </w:tabs>
+              <w:spacing w:after="331" w:line="259" w:lineRule="auto"/>
+              <w:ind w:left="0" w:firstLine="0"/>
+            </w:pPr>
+            <w:r>
+              <w:t>Beg</w:t>
+            </w:r>
+            <w:r>
+              <w:t>i</w:t>
+            </w:r>
+            <w:r>
+              <w:t xml:space="preserve">n </w:t>
+            </w:r>
+            <w:r>
+              <w:t xml:space="preserve">work </w:t>
+            </w:r>
+            <w:r>
+              <w:t>on the Py4J Gateway</w:t>
             </w:r>
           </w:p>
         </w:tc>
@@ -2201,13 +2648,34 @@
               <w:ind w:left="0" w:firstLine="0"/>
             </w:pPr>
             <w:r>
-              <w:t xml:space="preserve">I was able to submit my coursework in time; </w:t>
-            </w:r>
-            <w:r>
-              <w:t>however,</w:t>
-            </w:r>
-            <w:r>
-              <w:t xml:space="preserve"> I had to do 2 more for the next upcoming weeks</w:t>
+              <w:t>Submitted draft of section titles and table of contents.</w:t>
+            </w:r>
+          </w:p>
+          <w:p>
+            <w:pPr>
+              <w:pBdr>
+                <w:top w:val="none" w:sz="0" w:space="0" w:color="auto"/>
+                <w:left w:val="none" w:sz="0" w:space="0" w:color="auto"/>
+                <w:bottom w:val="none" w:sz="0" w:space="0" w:color="auto"/>
+                <w:right w:val="none" w:sz="0" w:space="0" w:color="auto"/>
+              </w:pBdr>
+              <w:tabs>
+                <w:tab w:val="center" w:pos="4324"/>
+              </w:tabs>
+              <w:spacing w:after="331" w:line="259" w:lineRule="auto"/>
+              <w:ind w:left="0" w:firstLine="0"/>
+            </w:pPr>
+            <w:r>
+              <w:t xml:space="preserve">Worked on the </w:t>
+            </w:r>
+            <w:r>
+              <w:t>Py4J Gateway to visualise if the</w:t>
+            </w:r>
+            <w:r>
+              <w:t xml:space="preserve"> </w:t>
+            </w:r>
+            <w:r>
+              <w:t>hyper-heuristic was performing as intended</w:t>
             </w:r>
           </w:p>
         </w:tc>
@@ -2230,7 +2698,7 @@
               <w:ind w:left="0" w:firstLine="0"/>
             </w:pPr>
             <w:r>
-              <w:t>No major comment needed</w:t>
+              <w:t>No comment needed</w:t>
             </w:r>
           </w:p>
         </w:tc>
@@ -2255,7 +2723,7 @@
               <w:ind w:left="0" w:firstLine="0"/>
             </w:pPr>
             <w:r>
-              <w:t>25/2/2026</w:t>
+              <w:t>11/3/2026</w:t>
             </w:r>
           </w:p>
         </w:tc>
@@ -2278,16 +2746,20 @@
               <w:ind w:left="0" w:firstLine="0"/>
             </w:pPr>
             <w:r>
-              <w:t xml:space="preserve">Made a start </w:t>
-            </w:r>
-            <w:r>
-              <w:t xml:space="preserve">on the </w:t>
-            </w:r>
-            <w:r>
-              <w:t xml:space="preserve">report headers, </w:t>
-            </w:r>
-            <w:r>
-              <w:t>however, still had more coursework to work on</w:t>
+              <w:t>Complete the Py4J Gateway</w:t>
+            </w:r>
+            <w:r>
+              <w:br/>
+            </w:r>
+            <w:r>
+              <w:br/>
+              <w:t>Beg</w:t>
+            </w:r>
+            <w:r>
+              <w:t>i</w:t>
+            </w:r>
+            <w:r>
+              <w:t>n the pre-training of my hyper-heuristic</w:t>
             </w:r>
           </w:p>
         </w:tc>
@@ -2309,6 +2781,20 @@
               <w:spacing w:after="331" w:line="259" w:lineRule="auto"/>
               <w:ind w:left="0" w:firstLine="0"/>
             </w:pPr>
+            <w:r>
+              <w:t>I was able to retrieve results that com</w:t>
+            </w:r>
+            <w:r>
+              <w:t xml:space="preserve">pared the performance of my Choice Function hyper-heuristic to the performance of the </w:t>
+            </w:r>
+            <w:proofErr w:type="spellStart"/>
+            <w:r>
+              <w:t>HyFlex</w:t>
+            </w:r>
+            <w:proofErr w:type="spellEnd"/>
+            <w:r>
+              <w:t xml:space="preserve"> algorithms</w:t>
+            </w:r>
           </w:p>
         </w:tc>
         <w:tc>
@@ -2329,6 +2815,20 @@
               <w:spacing w:after="331" w:line="259" w:lineRule="auto"/>
               <w:ind w:left="0" w:firstLine="0"/>
             </w:pPr>
+            <w:r>
+              <w:t xml:space="preserve">My hyper-heuristic didn’t perform as well as the other three </w:t>
+            </w:r>
+            <w:proofErr w:type="spellStart"/>
+            <w:r>
+              <w:t>HyFlex</w:t>
+            </w:r>
+            <w:proofErr w:type="spellEnd"/>
+            <w:r>
+              <w:t xml:space="preserve"> HHs, so I decided to do tweak the model </w:t>
+            </w:r>
+            <w:r>
+              <w:t>later</w:t>
+            </w:r>
           </w:p>
         </w:tc>
       </w:tr>
@@ -2352,7 +2852,7 @@
               <w:ind w:left="0" w:firstLine="0"/>
             </w:pPr>
             <w:r>
-              <w:t>4/3/2026</w:t>
+              <w:t>15/3/2026</w:t>
             </w:r>
           </w:p>
         </w:tc>
@@ -2374,6 +2874,12 @@
               <w:spacing w:after="331" w:line="259" w:lineRule="auto"/>
               <w:ind w:left="0" w:firstLine="0"/>
             </w:pPr>
+            <w:r>
+              <w:t xml:space="preserve">Consider using </w:t>
+            </w:r>
+            <w:r>
+              <w:t>Q-Table for pretraining.</w:t>
+            </w:r>
           </w:p>
         </w:tc>
         <w:tc>
@@ -2394,6 +2900,18 @@
               <w:spacing w:after="331" w:line="259" w:lineRule="auto"/>
               <w:ind w:left="0" w:firstLine="0"/>
             </w:pPr>
+            <w:r>
+              <w:t xml:space="preserve">Choice Function dominates </w:t>
+            </w:r>
+            <w:r>
+              <w:t>my priorities.</w:t>
+            </w:r>
+            <w:r>
+              <w:t xml:space="preserve"> </w:t>
+            </w:r>
+            <w:r>
+              <w:t>The results from the fitness trace are still stochastically randomised</w:t>
+            </w:r>
           </w:p>
         </w:tc>
         <w:tc>
@@ -2414,6 +2932,36 @@
               <w:spacing w:after="331" w:line="259" w:lineRule="auto"/>
               <w:ind w:left="0" w:firstLine="0"/>
             </w:pPr>
+            <w:r>
+              <w:t xml:space="preserve">Normalised </w:t>
+            </w:r>
+            <w:r>
+              <w:t>C</w:t>
+            </w:r>
+            <w:r>
+              <w:t xml:space="preserve">hoice </w:t>
+            </w:r>
+            <w:r>
+              <w:t>F</w:t>
+            </w:r>
+            <w:r>
+              <w:t>unction value</w:t>
+            </w:r>
+            <w:r>
+              <w:t>s</w:t>
+            </w:r>
+            <w:r>
+              <w:t xml:space="preserve"> so </w:t>
+            </w:r>
+            <w:r>
+              <w:t>values in the Q-Table</w:t>
+            </w:r>
+            <w:r>
+              <w:t xml:space="preserve"> </w:t>
+            </w:r>
+            <w:r>
+              <w:t>do not get overwhelmed by the choice function</w:t>
+            </w:r>
           </w:p>
         </w:tc>
       </w:tr>
@@ -2437,8 +2985,7 @@
               <w:ind w:left="0" w:firstLine="0"/>
             </w:pPr>
             <w:r>
-              <w:lastRenderedPageBreak/>
-              <w:t>11/3/2026</w:t>
+              <w:t>16/3/2026</w:t>
             </w:r>
           </w:p>
         </w:tc>
@@ -2460,6 +3007,15 @@
               <w:spacing w:after="331" w:line="259" w:lineRule="auto"/>
               <w:ind w:left="0" w:firstLine="0"/>
             </w:pPr>
+            <w:r>
+              <w:t xml:space="preserve">Fix </w:t>
+            </w:r>
+            <w:r>
+              <w:t>Choice Function and Q-Value Table mix-up</w:t>
+            </w:r>
+            <w:r>
+              <w:t>.</w:t>
+            </w:r>
           </w:p>
         </w:tc>
         <w:tc>
@@ -2480,6 +3036,20 @@
               <w:spacing w:after="331" w:line="259" w:lineRule="auto"/>
               <w:ind w:left="0" w:firstLine="0"/>
             </w:pPr>
+            <w:r>
+              <w:t>Hyper-heuristic was able to be successfully pre-trained with a balance of the Choice Function and Q-Table</w:t>
+            </w:r>
+            <w:r>
+              <w:t xml:space="preserve">. Produced results of the pre-trained hyper-heuristic for all the </w:t>
+            </w:r>
+            <w:proofErr w:type="spellStart"/>
+            <w:r>
+              <w:t>HyFlex</w:t>
+            </w:r>
+            <w:proofErr w:type="spellEnd"/>
+            <w:r>
+              <w:t xml:space="preserve"> problem domains</w:t>
+            </w:r>
           </w:p>
         </w:tc>
         <w:tc>
@@ -2500,6 +3070,9 @@
               <w:spacing w:after="331" w:line="259" w:lineRule="auto"/>
               <w:ind w:left="0" w:firstLine="0"/>
             </w:pPr>
+            <w:r>
+              <w:t>Now fixed with a balance of early-exploration using Choice Function and late-exploitation with the Q-Table. If surrogate model is active, then there is 50/50 chance for either Choice Function or Q-Table</w:t>
+            </w:r>
           </w:p>
         </w:tc>
       </w:tr>
@@ -2523,7 +3096,7 @@
               <w:ind w:left="0" w:firstLine="0"/>
             </w:pPr>
             <w:r>
-              <w:t>15/3/2026</w:t>
+              <w:t>17/3/2026</w:t>
             </w:r>
           </w:p>
         </w:tc>
@@ -2546,7 +3119,28 @@
               <w:ind w:left="0" w:firstLine="0"/>
             </w:pPr>
             <w:r>
-              <w:t>Q-Table never used for pretraining. Choice Function dominates prioritisation</w:t>
+              <w:t>Finish and submit poster draft</w:t>
+            </w:r>
+            <w:r>
+              <w:t xml:space="preserve"> to supervisor</w:t>
+            </w:r>
+          </w:p>
+          <w:p>
+            <w:pPr>
+              <w:pBdr>
+                <w:top w:val="none" w:sz="0" w:space="0" w:color="auto"/>
+                <w:left w:val="none" w:sz="0" w:space="0" w:color="auto"/>
+                <w:bottom w:val="none" w:sz="0" w:space="0" w:color="auto"/>
+                <w:right w:val="none" w:sz="0" w:space="0" w:color="auto"/>
+              </w:pBdr>
+              <w:tabs>
+                <w:tab w:val="center" w:pos="4324"/>
+              </w:tabs>
+              <w:spacing w:after="331" w:line="259" w:lineRule="auto"/>
+              <w:ind w:left="0" w:firstLine="0"/>
+            </w:pPr>
+            <w:r>
+              <w:t>Finish pre-training the hyper-heuristic</w:t>
             </w:r>
           </w:p>
         </w:tc>
@@ -2569,7 +3163,7 @@
               <w:ind w:left="0" w:firstLine="0"/>
             </w:pPr>
             <w:r>
-              <w:t>The results from the fitness trace are still stochastically randomised</w:t>
+              <w:t>The visualised result plots of the pre-trained hyper-heuristic showed that in certain problem domains, pre-training had improved the performance of the hyper-heuristic</w:t>
             </w:r>
           </w:p>
         </w:tc>
@@ -2592,7 +3186,19 @@
               <w:ind w:left="0" w:firstLine="0"/>
             </w:pPr>
             <w:r>
-              <w:t>Normalised choice function value so q-values doesn’t get swamped</w:t>
+              <w:t xml:space="preserve">This answered the question </w:t>
+            </w:r>
+            <w:r>
+              <w:t>that</w:t>
+            </w:r>
+            <w:r>
+              <w:t xml:space="preserve"> pre-training </w:t>
+            </w:r>
+            <w:r>
+              <w:t xml:space="preserve">a hyper-heuristic </w:t>
+            </w:r>
+            <w:r>
+              <w:t>is possible</w:t>
             </w:r>
           </w:p>
         </w:tc>
@@ -2617,7 +3223,7 @@
               <w:ind w:left="0" w:firstLine="0"/>
             </w:pPr>
             <w:r>
-              <w:t>16/3/2026</w:t>
+              <w:t>19/3/2026</w:t>
             </w:r>
           </w:p>
         </w:tc>
@@ -2640,10 +3246,16 @@
               <w:ind w:left="0" w:firstLine="0"/>
             </w:pPr>
             <w:r>
-              <w:t>Choice Function and Q-Value Table mix-up</w:t>
-            </w:r>
-            <w:r>
-              <w:t>.</w:t>
+              <w:t>Discuss</w:t>
+            </w:r>
+            <w:r>
+              <w:t xml:space="preserve"> poster </w:t>
+            </w:r>
+            <w:r>
+              <w:t>and</w:t>
+            </w:r>
+            <w:r>
+              <w:t xml:space="preserve"> pre-trained results with supervisor.</w:t>
             </w:r>
           </w:p>
         </w:tc>
@@ -2666,7 +3278,13 @@
               <w:ind w:left="0" w:firstLine="0"/>
             </w:pPr>
             <w:r>
-              <w:t xml:space="preserve">No exploration from </w:t>
+              <w:t>The poster looked good</w:t>
+            </w:r>
+            <w:r>
+              <w:t>,</w:t>
+            </w:r>
+            <w:r>
+              <w:t xml:space="preserve"> with inconsistencies and errors in the poster draft. A final extension task was agreed on that would view the effects of pre-training through frozen Q-Table transfer</w:t>
             </w:r>
           </w:p>
         </w:tc>
@@ -2688,6 +3306,15 @@
               <w:spacing w:after="331" w:line="259" w:lineRule="auto"/>
               <w:ind w:left="0" w:firstLine="0"/>
             </w:pPr>
+            <w:r>
+              <w:t>The frozen Q-Table transfer</w:t>
+            </w:r>
+            <w:r>
+              <w:t xml:space="preserve"> would pre-train on a single problem instance, and then the Q-Table produced would be transferred and run on 3 different problem instances</w:t>
+            </w:r>
+            <w:r>
+              <w:t xml:space="preserve"> </w:t>
+            </w:r>
           </w:p>
         </w:tc>
       </w:tr>
@@ -2711,7 +3338,13 @@
               <w:ind w:left="0" w:firstLine="0"/>
             </w:pPr>
             <w:r>
-              <w:t>17/3/2026</w:t>
+              <w:t>2</w:t>
+            </w:r>
+            <w:r>
+              <w:t>3</w:t>
+            </w:r>
+            <w:r>
+              <w:t>/3/2026</w:t>
             </w:r>
           </w:p>
         </w:tc>
@@ -2734,7 +3367,10 @@
               <w:ind w:left="0" w:firstLine="0"/>
             </w:pPr>
             <w:r>
-              <w:t>Finished and submitted poster draft, and sent it to supervisor</w:t>
+              <w:t>Submit poster to be printe</w:t>
+            </w:r>
+            <w:r>
+              <w:t>d</w:t>
             </w:r>
           </w:p>
         </w:tc>
@@ -2756,6 +3392,9 @@
               <w:spacing w:after="331" w:line="259" w:lineRule="auto"/>
               <w:ind w:left="0" w:firstLine="0"/>
             </w:pPr>
+            <w:r>
+              <w:t>I did not continue with the project as I had one last coursework needed to be submitted before end of term</w:t>
+            </w:r>
           </w:p>
         </w:tc>
         <w:tc>
@@ -2776,6 +3415,9 @@
               <w:spacing w:after="331" w:line="259" w:lineRule="auto"/>
               <w:ind w:left="0" w:firstLine="0"/>
             </w:pPr>
+            <w:r>
+              <w:t>No comment needed</w:t>
+            </w:r>
           </w:p>
         </w:tc>
       </w:tr>
@@ -2799,7 +3441,7 @@
               <w:ind w:left="0" w:firstLine="0"/>
             </w:pPr>
             <w:r>
-              <w:t>19/3/2026</w:t>
+              <w:t>Break</w:t>
             </w:r>
           </w:p>
         </w:tc>
@@ -2822,7 +3464,7 @@
               <w:ind w:left="0" w:firstLine="0"/>
             </w:pPr>
             <w:r>
-              <w:t xml:space="preserve">Show poster to supervisor, discussed pre-trained results with supervisor. </w:t>
+              <w:t>Easter holiday</w:t>
             </w:r>
           </w:p>
         </w:tc>
@@ -2887,7 +3529,14 @@
               <w:ind w:left="0" w:firstLine="0"/>
             </w:pPr>
             <w:r>
-              <w:t>25/3/2026</w:t>
+              <w:lastRenderedPageBreak/>
+              <w:t>1</w:t>
+            </w:r>
+            <w:r>
+              <w:t>4</w:t>
+            </w:r>
+            <w:r>
+              <w:t>/4/2026</w:t>
             </w:r>
           </w:p>
         </w:tc>
@@ -2909,6 +3558,39 @@
               <w:spacing w:after="331" w:line="259" w:lineRule="auto"/>
               <w:ind w:left="0" w:firstLine="0"/>
             </w:pPr>
+            <w:r>
+              <w:t>W</w:t>
+            </w:r>
+            <w:r>
+              <w:t>ork on the extension task for frozen Q-Table transfer</w:t>
+            </w:r>
+            <w:r>
+              <w:t>.</w:t>
+            </w:r>
+          </w:p>
+          <w:p>
+            <w:pPr>
+              <w:pBdr>
+                <w:top w:val="none" w:sz="0" w:space="0" w:color="auto"/>
+                <w:left w:val="none" w:sz="0" w:space="0" w:color="auto"/>
+                <w:bottom w:val="none" w:sz="0" w:space="0" w:color="auto"/>
+                <w:right w:val="none" w:sz="0" w:space="0" w:color="auto"/>
+              </w:pBdr>
+              <w:tabs>
+                <w:tab w:val="center" w:pos="4324"/>
+              </w:tabs>
+              <w:spacing w:after="331" w:line="259" w:lineRule="auto"/>
+              <w:ind w:left="0" w:firstLine="0"/>
+            </w:pPr>
+            <w:r>
+              <w:t>Beg</w:t>
+            </w:r>
+            <w:r>
+              <w:t>i</w:t>
+            </w:r>
+            <w:r>
+              <w:t>n writing the introduction and literature review for the report</w:t>
+            </w:r>
           </w:p>
         </w:tc>
         <w:tc>
@@ -2929,6 +3611,15 @@
               <w:spacing w:after="331" w:line="259" w:lineRule="auto"/>
               <w:ind w:left="0" w:firstLine="0"/>
             </w:pPr>
+            <w:r>
+              <w:t xml:space="preserve">Successfully pre-trained the hyper-heuristic on a single instance of a problem domain and then </w:t>
+            </w:r>
+            <w:r>
+              <w:t>transferred</w:t>
+            </w:r>
+            <w:r>
+              <w:t xml:space="preserve"> that Q-Table to different problem instances</w:t>
+            </w:r>
           </w:p>
         </w:tc>
         <w:tc>
@@ -2949,6 +3640,15 @@
               <w:spacing w:after="331" w:line="259" w:lineRule="auto"/>
               <w:ind w:left="0" w:firstLine="0"/>
             </w:pPr>
+            <w:r>
+              <w:t>Still need to visualise the results of the pre-training from the extension task. Then, I c</w:t>
+            </w:r>
+            <w:r>
+              <w:t>an</w:t>
+            </w:r>
+            <w:r>
+              <w:t xml:space="preserve"> focus on doing the report for my project</w:t>
+            </w:r>
           </w:p>
         </w:tc>
       </w:tr>
@@ -2972,7 +3672,7 @@
               <w:ind w:left="0" w:firstLine="0"/>
             </w:pPr>
             <w:r>
-              <w:t>7/4/2026</w:t>
+              <w:t>19/4/2026</w:t>
             </w:r>
           </w:p>
         </w:tc>
@@ -2994,6 +3694,36 @@
               <w:spacing w:after="331" w:line="259" w:lineRule="auto"/>
               <w:ind w:left="0" w:firstLine="0"/>
             </w:pPr>
+            <w:r>
+              <w:t>Finish the frozen Q-Table transfer extension task</w:t>
+            </w:r>
+            <w:r>
+              <w:t>.</w:t>
+            </w:r>
+          </w:p>
+          <w:p>
+            <w:pPr>
+              <w:pBdr>
+                <w:top w:val="none" w:sz="0" w:space="0" w:color="auto"/>
+                <w:left w:val="none" w:sz="0" w:space="0" w:color="auto"/>
+                <w:bottom w:val="none" w:sz="0" w:space="0" w:color="auto"/>
+                <w:right w:val="none" w:sz="0" w:space="0" w:color="auto"/>
+              </w:pBdr>
+              <w:tabs>
+                <w:tab w:val="center" w:pos="4324"/>
+              </w:tabs>
+              <w:spacing w:after="331" w:line="259" w:lineRule="auto"/>
+              <w:ind w:left="0" w:firstLine="0"/>
+            </w:pPr>
+            <w:r>
+              <w:t>Beg</w:t>
+            </w:r>
+            <w:r>
+              <w:t>i</w:t>
+            </w:r>
+            <w:r>
+              <w:t>n the methodology and the result sections in my report</w:t>
+            </w:r>
           </w:p>
         </w:tc>
         <w:tc>
@@ -3014,6 +3744,12 @@
               <w:spacing w:after="331" w:line="259" w:lineRule="auto"/>
               <w:ind w:left="0" w:firstLine="0"/>
             </w:pPr>
+            <w:r>
+              <w:t>Visualised the effects of pre-training through</w:t>
+            </w:r>
+            <w:r>
+              <w:t xml:space="preserve"> fitness traces, heuristic usage counts and visualised the general improvement of pre-training across problem domains</w:t>
+            </w:r>
           </w:p>
         </w:tc>
         <w:tc>
@@ -3034,6 +3770,9 @@
               <w:spacing w:after="331" w:line="259" w:lineRule="auto"/>
               <w:ind w:left="0" w:firstLine="0"/>
             </w:pPr>
+            <w:r>
+              <w:t>This was the final coding task that needed to be done for the project</w:t>
+            </w:r>
           </w:p>
         </w:tc>
       </w:tr>
@@ -3056,6 +3795,9 @@
               <w:spacing w:after="331" w:line="259" w:lineRule="auto"/>
               <w:ind w:left="0" w:firstLine="0"/>
             </w:pPr>
+            <w:r>
+              <w:t>23/4/2026</w:t>
+            </w:r>
           </w:p>
         </w:tc>
         <w:tc>
@@ -3076,6 +3818,24 @@
               <w:spacing w:after="331" w:line="259" w:lineRule="auto"/>
               <w:ind w:left="0" w:firstLine="0"/>
             </w:pPr>
+            <w:r>
+              <w:t>Complete</w:t>
+            </w:r>
+            <w:r>
+              <w:t xml:space="preserve"> a draft </w:t>
+            </w:r>
+            <w:r>
+              <w:t>of</w:t>
+            </w:r>
+            <w:r>
+              <w:t xml:space="preserve"> the report</w:t>
+            </w:r>
+            <w:r>
+              <w:t xml:space="preserve"> and submit</w:t>
+            </w:r>
+            <w:r>
+              <w:t xml:space="preserve"> to my supervisor</w:t>
+            </w:r>
           </w:p>
         </w:tc>
         <w:tc>
@@ -3096,6 +3856,27 @@
               <w:spacing w:after="331" w:line="259" w:lineRule="auto"/>
               <w:ind w:left="0" w:firstLine="0"/>
             </w:pPr>
+            <w:r>
+              <w:t xml:space="preserve">Feedback </w:t>
+            </w:r>
+            <w:r>
+              <w:t>on</w:t>
+            </w:r>
+            <w:r>
+              <w:t xml:space="preserve"> the report was </w:t>
+            </w:r>
+            <w:r>
+              <w:t>received</w:t>
+            </w:r>
+            <w:r>
+              <w:t xml:space="preserve"> </w:t>
+            </w:r>
+            <w:r>
+              <w:t xml:space="preserve">which allowed final updates </w:t>
+            </w:r>
+            <w:r>
+              <w:t>to the report and the logbook ready for submission</w:t>
+            </w:r>
           </w:p>
         </w:tc>
         <w:tc>
@@ -3116,6 +3897,12 @@
               <w:spacing w:after="331" w:line="259" w:lineRule="auto"/>
               <w:ind w:left="0" w:firstLine="0"/>
             </w:pPr>
+            <w:r>
+              <w:t>Needed to adjust certain figures in my report</w:t>
+            </w:r>
+            <w:r>
+              <w:t xml:space="preserve"> to make them more readable and adjust some page layouts.</w:t>
+            </w:r>
           </w:p>
         </w:tc>
       </w:tr>
@@ -3138,6 +3925,9 @@
               <w:spacing w:after="331" w:line="259" w:lineRule="auto"/>
               <w:ind w:left="0" w:firstLine="0"/>
             </w:pPr>
+            <w:r>
+              <w:t>XX/4/2026</w:t>
+            </w:r>
           </w:p>
         </w:tc>
         <w:tc>
@@ -3158,6 +3948,15 @@
               <w:spacing w:after="331" w:line="259" w:lineRule="auto"/>
               <w:ind w:left="0" w:firstLine="0"/>
             </w:pPr>
+            <w:r>
+              <w:t>Complet</w:t>
+            </w:r>
+            <w:r>
+              <w:t>e</w:t>
+            </w:r>
+            <w:r>
+              <w:t xml:space="preserve"> the project</w:t>
+            </w:r>
           </w:p>
         </w:tc>
         <w:tc>
@@ -3178,6 +3977,9 @@
               <w:spacing w:after="331" w:line="259" w:lineRule="auto"/>
               <w:ind w:left="0" w:firstLine="0"/>
             </w:pPr>
+            <w:r>
+              <w:t>Submitted the full dissertation and project code to ELE</w:t>
+            </w:r>
           </w:p>
         </w:tc>
         <w:tc>

</xml_diff>

<commit_message>
Updated logbook, added project report, test to allow Java builds from .gitignore
</commit_message>
<xml_diff>
--- a/docs/ECM3401 activity_log_form.docx
+++ b/docs/ECM3401 activity_log_form.docx
@@ -3926,7 +3926,10 @@
               <w:ind w:left="0" w:firstLine="0"/>
             </w:pPr>
             <w:r>
-              <w:t>XX/4/2026</w:t>
+              <w:t>27</w:t>
+            </w:r>
+            <w:r>
+              <w:t>/4/2026</w:t>
             </w:r>
           </w:p>
         </w:tc>
@@ -4000,6 +4003,9 @@
               <w:spacing w:after="331" w:line="259" w:lineRule="auto"/>
               <w:ind w:left="0" w:firstLine="0"/>
             </w:pPr>
+            <w:r>
+              <w:t>No comment needed</w:t>
+            </w:r>
           </w:p>
         </w:tc>
       </w:tr>

</xml_diff>